<commit_message>
Updated docs at 17th may 26
</commit_message>
<xml_diff>
--- a/flutter more documents/f39_google_maps_for_flutter.docx
+++ b/flutter more documents/f39_google_maps_for_flutter.docx
@@ -1448,17 +1448,280 @@
           <w:sz w:val="36"/>
           <w:szCs w:val="36"/>
         </w:rPr>
+        <w:t xml:space="preserve">        …</w:t>
+      </w:r>
+      <w:r>
+        <w:rPr>
+          <w:b/>
+          <w:bCs/>
+          <w:color w:val="D86DCB" w:themeColor="accent5" w:themeTint="99"/>
+          <w:sz w:val="36"/>
+          <w:szCs w:val="36"/>
+        </w:rPr>
+        <w:t>&gt;</w:t>
+      </w:r>
+    </w:p>
+    <w:p>
+      <w:pPr>
+        <w:jc w:val="both"/>
+        <w:rPr>
+          <w:b/>
+          <w:bCs/>
+          <w:color w:val="D86DCB" w:themeColor="accent5" w:themeTint="99"/>
+          <w:sz w:val="36"/>
+          <w:szCs w:val="36"/>
+        </w:rPr>
+      </w:pPr>
+      <w:r>
+        <w:rPr>
+          <w:b/>
+          <w:bCs/>
+          <w:color w:val="D86DCB" w:themeColor="accent5" w:themeTint="99"/>
+          <w:sz w:val="36"/>
+          <w:szCs w:val="36"/>
+        </w:rPr>
         <w:t xml:space="preserve">        </w:t>
       </w:r>
-      <w:r>
-        <w:rPr>
-          <w:b/>
-          <w:bCs/>
-          <w:color w:val="D86DCB" w:themeColor="accent5" w:themeTint="99"/>
-          <w:sz w:val="36"/>
-          <w:szCs w:val="36"/>
-        </w:rPr>
-        <w:t>…</w:t>
+      <w:proofErr w:type="gramStart"/>
+      <w:r>
+        <w:rPr>
+          <w:b/>
+          <w:bCs/>
+          <w:color w:val="D86DCB" w:themeColor="accent5" w:themeTint="99"/>
+          <w:sz w:val="36"/>
+          <w:szCs w:val="36"/>
+        </w:rPr>
+        <w:t>&lt;!--</w:t>
+      </w:r>
+      <w:proofErr w:type="gramEnd"/>
+      <w:r>
+        <w:rPr>
+          <w:b/>
+          <w:bCs/>
+          <w:color w:val="D86DCB" w:themeColor="accent5" w:themeTint="99"/>
+          <w:sz w:val="36"/>
+          <w:szCs w:val="36"/>
+        </w:rPr>
+        <w:t xml:space="preserve"> added for google maps API key --&gt;</w:t>
+      </w:r>
+    </w:p>
+    <w:p>
+      <w:pPr>
+        <w:jc w:val="both"/>
+        <w:rPr>
+          <w:b/>
+          <w:bCs/>
+          <w:color w:val="D86DCB" w:themeColor="accent5" w:themeTint="99"/>
+          <w:sz w:val="36"/>
+          <w:szCs w:val="36"/>
+        </w:rPr>
+      </w:pPr>
+      <w:r>
+        <w:rPr>
+          <w:b/>
+          <w:bCs/>
+          <w:color w:val="D86DCB" w:themeColor="accent5" w:themeTint="99"/>
+          <w:sz w:val="36"/>
+          <w:szCs w:val="36"/>
+        </w:rPr>
+        <w:t xml:space="preserve">        &lt;meta-data </w:t>
+      </w:r>
+      <w:proofErr w:type="spellStart"/>
+      <w:r>
+        <w:rPr>
+          <w:b/>
+          <w:bCs/>
+          <w:color w:val="D86DCB" w:themeColor="accent5" w:themeTint="99"/>
+          <w:sz w:val="36"/>
+          <w:szCs w:val="36"/>
+        </w:rPr>
+        <w:t>android:name</w:t>
+      </w:r>
+      <w:proofErr w:type="spellEnd"/>
+      <w:r>
+        <w:rPr>
+          <w:b/>
+          <w:bCs/>
+          <w:color w:val="D86DCB" w:themeColor="accent5" w:themeTint="99"/>
+          <w:sz w:val="36"/>
+          <w:szCs w:val="36"/>
+        </w:rPr>
+        <w:t>="</w:t>
+      </w:r>
+      <w:proofErr w:type="spellStart"/>
+      <w:r>
+        <w:rPr>
+          <w:b/>
+          <w:bCs/>
+          <w:color w:val="D86DCB" w:themeColor="accent5" w:themeTint="99"/>
+          <w:sz w:val="36"/>
+          <w:szCs w:val="36"/>
+        </w:rPr>
+        <w:t>com.google.android.geo.API_KEY</w:t>
+      </w:r>
+      <w:proofErr w:type="spellEnd"/>
+      <w:r>
+        <w:rPr>
+          <w:b/>
+          <w:bCs/>
+          <w:color w:val="D86DCB" w:themeColor="accent5" w:themeTint="99"/>
+          <w:sz w:val="36"/>
+          <w:szCs w:val="36"/>
+        </w:rPr>
+        <w:t>"</w:t>
+      </w:r>
+    </w:p>
+    <w:p>
+      <w:pPr>
+        <w:jc w:val="both"/>
+        <w:rPr>
+          <w:b/>
+          <w:bCs/>
+          <w:color w:val="D86DCB" w:themeColor="accent5" w:themeTint="99"/>
+          <w:sz w:val="36"/>
+          <w:szCs w:val="36"/>
+        </w:rPr>
+      </w:pPr>
+      <w:r>
+        <w:rPr>
+          <w:b/>
+          <w:bCs/>
+          <w:color w:val="D86DCB" w:themeColor="accent5" w:themeTint="99"/>
+          <w:sz w:val="36"/>
+          <w:szCs w:val="36"/>
+        </w:rPr>
+        <w:t xml:space="preserve">            </w:t>
+      </w:r>
+      <w:proofErr w:type="spellStart"/>
+      <w:r>
+        <w:rPr>
+          <w:b/>
+          <w:bCs/>
+          <w:color w:val="D86DCB" w:themeColor="accent5" w:themeTint="99"/>
+          <w:sz w:val="36"/>
+          <w:szCs w:val="36"/>
+        </w:rPr>
+        <w:t>android:value</w:t>
+      </w:r>
+      <w:proofErr w:type="spellEnd"/>
+      <w:r>
+        <w:rPr>
+          <w:b/>
+          <w:bCs/>
+          <w:color w:val="D86DCB" w:themeColor="accent5" w:themeTint="99"/>
+          <w:sz w:val="36"/>
+          <w:szCs w:val="36"/>
+        </w:rPr>
+        <w:t xml:space="preserve">="Our API KEY"/&gt; </w:t>
+      </w:r>
+      <w:proofErr w:type="gramStart"/>
+      <w:r>
+        <w:rPr>
+          <w:b/>
+          <w:bCs/>
+          <w:color w:val="D86DCB" w:themeColor="accent5" w:themeTint="99"/>
+          <w:sz w:val="36"/>
+          <w:szCs w:val="36"/>
+        </w:rPr>
+        <w:t>&lt;!--</w:t>
+      </w:r>
+      <w:proofErr w:type="gramEnd"/>
+      <w:r>
+        <w:rPr>
+          <w:b/>
+          <w:bCs/>
+          <w:color w:val="D86DCB" w:themeColor="accent5" w:themeTint="99"/>
+          <w:sz w:val="36"/>
+          <w:szCs w:val="36"/>
+        </w:rPr>
+        <w:t xml:space="preserve"> add the API key here --&gt;</w:t>
+      </w:r>
+    </w:p>
+    <w:p>
+      <w:pPr>
+        <w:jc w:val="both"/>
+        <w:rPr>
+          <w:b/>
+          <w:bCs/>
+          <w:color w:val="D86DCB" w:themeColor="accent5" w:themeTint="99"/>
+          <w:sz w:val="36"/>
+          <w:szCs w:val="36"/>
+        </w:rPr>
+      </w:pPr>
+      <w:r>
+        <w:rPr>
+          <w:b/>
+          <w:bCs/>
+          <w:color w:val="D86DCB" w:themeColor="accent5" w:themeTint="99"/>
+          <w:sz w:val="36"/>
+          <w:szCs w:val="36"/>
+        </w:rPr>
+        <w:lastRenderedPageBreak/>
+        <w:t xml:space="preserve">        </w:t>
+      </w:r>
+      <w:r>
+        <w:rPr>
+          <w:b/>
+          <w:bCs/>
+          <w:color w:val="D86DCB" w:themeColor="accent5" w:themeTint="99"/>
+          <w:sz w:val="36"/>
+          <w:szCs w:val="36"/>
+        </w:rPr>
+        <w:t>&lt;activity</w:t>
+      </w:r>
+    </w:p>
+    <w:p>
+      <w:pPr>
+        <w:jc w:val="both"/>
+        <w:rPr>
+          <w:b/>
+          <w:bCs/>
+          <w:color w:val="D86DCB" w:themeColor="accent5" w:themeTint="99"/>
+          <w:sz w:val="36"/>
+          <w:szCs w:val="36"/>
+        </w:rPr>
+      </w:pPr>
+      <w:r>
+        <w:rPr>
+          <w:b/>
+          <w:bCs/>
+          <w:color w:val="D86DCB" w:themeColor="accent5" w:themeTint="99"/>
+          <w:sz w:val="36"/>
+          <w:szCs w:val="36"/>
+        </w:rPr>
+        <w:t xml:space="preserve">               …</w:t>
+      </w:r>
+    </w:p>
+    <w:p>
+      <w:pPr>
+        <w:jc w:val="both"/>
+        <w:rPr>
+          <w:b/>
+          <w:bCs/>
+          <w:color w:val="D86DCB" w:themeColor="accent5" w:themeTint="99"/>
+          <w:sz w:val="36"/>
+          <w:szCs w:val="36"/>
+        </w:rPr>
+      </w:pPr>
+      <w:r>
+        <w:rPr>
+          <w:b/>
+          <w:bCs/>
+          <w:color w:val="D86DCB" w:themeColor="accent5" w:themeTint="99"/>
+          <w:sz w:val="36"/>
+          <w:szCs w:val="36"/>
+        </w:rPr>
+        <w:t xml:space="preserve">        </w:t>
+      </w:r>
+      <w:r>
+        <w:rPr>
+          <w:b/>
+          <w:bCs/>
+          <w:color w:val="D86DCB" w:themeColor="accent5" w:themeTint="99"/>
+          <w:sz w:val="36"/>
+          <w:szCs w:val="36"/>
+        </w:rPr>
+        <w:t>&lt;/activity</w:t>
       </w:r>
       <w:r>
         <w:rPr>
@@ -1475,22 +1738,308 @@
       <w:pPr>
         <w:jc w:val="both"/>
         <w:rPr>
-          <w:b/>
-          <w:bCs/>
-          <w:color w:val="D86DCB" w:themeColor="accent5" w:themeTint="99"/>
-          <w:sz w:val="36"/>
-          <w:szCs w:val="36"/>
-        </w:rPr>
-      </w:pPr>
-      <w:r>
-        <w:rPr>
-          <w:b/>
-          <w:bCs/>
-          <w:color w:val="D86DCB" w:themeColor="accent5" w:themeTint="99"/>
-          <w:sz w:val="36"/>
-          <w:szCs w:val="36"/>
-        </w:rPr>
-        <w:t xml:space="preserve">        </w:t>
+          <w:sz w:val="36"/>
+          <w:szCs w:val="36"/>
+        </w:rPr>
+      </w:pPr>
+      <w:r>
+        <w:rPr>
+          <w:sz w:val="36"/>
+          <w:szCs w:val="36"/>
+        </w:rPr>
+        <w:t xml:space="preserve"># For iOS, go to </w:t>
+      </w:r>
+      <w:proofErr w:type="spellStart"/>
+      <w:r>
+        <w:rPr>
+          <w:b/>
+          <w:bCs/>
+          <w:sz w:val="36"/>
+          <w:szCs w:val="36"/>
+        </w:rPr>
+        <w:t>project_root</w:t>
+      </w:r>
+      <w:proofErr w:type="spellEnd"/>
+      <w:r>
+        <w:rPr>
+          <w:b/>
+          <w:bCs/>
+          <w:sz w:val="36"/>
+          <w:szCs w:val="36"/>
+        </w:rPr>
+        <w:t>/</w:t>
+      </w:r>
+      <w:proofErr w:type="spellStart"/>
+      <w:r>
+        <w:rPr>
+          <w:b/>
+          <w:bCs/>
+          <w:sz w:val="36"/>
+          <w:szCs w:val="36"/>
+        </w:rPr>
+        <w:t>ios</w:t>
+      </w:r>
+      <w:proofErr w:type="spellEnd"/>
+      <w:r>
+        <w:rPr>
+          <w:b/>
+          <w:bCs/>
+          <w:sz w:val="36"/>
+          <w:szCs w:val="36"/>
+        </w:rPr>
+        <w:t>/runner/</w:t>
+      </w:r>
+      <w:proofErr w:type="spellStart"/>
+      <w:r>
+        <w:rPr>
+          <w:b/>
+          <w:bCs/>
+          <w:sz w:val="36"/>
+          <w:szCs w:val="36"/>
+        </w:rPr>
+        <w:t>AppDelegate.swift</w:t>
+      </w:r>
+      <w:proofErr w:type="spellEnd"/>
+      <w:r>
+        <w:rPr>
+          <w:sz w:val="36"/>
+          <w:szCs w:val="36"/>
+        </w:rPr>
+        <w:t xml:space="preserve"> and add these codes:</w:t>
+      </w:r>
+    </w:p>
+    <w:p>
+      <w:pPr>
+        <w:jc w:val="both"/>
+        <w:rPr>
+          <w:b/>
+          <w:bCs/>
+          <w:color w:val="D86DCB" w:themeColor="accent5" w:themeTint="99"/>
+          <w:sz w:val="36"/>
+          <w:szCs w:val="36"/>
+        </w:rPr>
+      </w:pPr>
+      <w:r>
+        <w:rPr>
+          <w:b/>
+          <w:bCs/>
+          <w:color w:val="D86DCB" w:themeColor="accent5" w:themeTint="99"/>
+          <w:sz w:val="36"/>
+          <w:szCs w:val="36"/>
+        </w:rPr>
+        <w:t xml:space="preserve">import </w:t>
+      </w:r>
+      <w:proofErr w:type="spellStart"/>
+      <w:r>
+        <w:rPr>
+          <w:b/>
+          <w:bCs/>
+          <w:color w:val="D86DCB" w:themeColor="accent5" w:themeTint="99"/>
+          <w:sz w:val="36"/>
+          <w:szCs w:val="36"/>
+        </w:rPr>
+        <w:t>UIKit</w:t>
+      </w:r>
+      <w:proofErr w:type="spellEnd"/>
+    </w:p>
+    <w:p>
+      <w:pPr>
+        <w:jc w:val="both"/>
+        <w:rPr>
+          <w:b/>
+          <w:bCs/>
+          <w:color w:val="D86DCB" w:themeColor="accent5" w:themeTint="99"/>
+          <w:sz w:val="36"/>
+          <w:szCs w:val="36"/>
+        </w:rPr>
+      </w:pPr>
+      <w:r>
+        <w:rPr>
+          <w:b/>
+          <w:bCs/>
+          <w:color w:val="D86DCB" w:themeColor="accent5" w:themeTint="99"/>
+          <w:sz w:val="36"/>
+          <w:szCs w:val="36"/>
+        </w:rPr>
+        <w:t>import Flutter</w:t>
+      </w:r>
+    </w:p>
+    <w:p>
+      <w:pPr>
+        <w:jc w:val="both"/>
+        <w:rPr>
+          <w:b/>
+          <w:bCs/>
+          <w:color w:val="D86DCB" w:themeColor="accent5" w:themeTint="99"/>
+          <w:sz w:val="36"/>
+          <w:szCs w:val="36"/>
+        </w:rPr>
+      </w:pPr>
+      <w:r>
+        <w:rPr>
+          <w:b/>
+          <w:bCs/>
+          <w:color w:val="D86DCB" w:themeColor="accent5" w:themeTint="99"/>
+          <w:sz w:val="36"/>
+          <w:szCs w:val="36"/>
+        </w:rPr>
+        <w:t xml:space="preserve">import </w:t>
+      </w:r>
+      <w:proofErr w:type="spellStart"/>
+      <w:r>
+        <w:rPr>
+          <w:b/>
+          <w:bCs/>
+          <w:color w:val="D86DCB" w:themeColor="accent5" w:themeTint="99"/>
+          <w:sz w:val="36"/>
+          <w:szCs w:val="36"/>
+        </w:rPr>
+        <w:t>GoogleMaps</w:t>
+      </w:r>
+      <w:proofErr w:type="spellEnd"/>
+    </w:p>
+    <w:p>
+      <w:pPr>
+        <w:jc w:val="both"/>
+        <w:rPr>
+          <w:b/>
+          <w:bCs/>
+          <w:color w:val="D86DCB" w:themeColor="accent5" w:themeTint="99"/>
+          <w:sz w:val="36"/>
+          <w:szCs w:val="36"/>
+        </w:rPr>
+      </w:pPr>
+    </w:p>
+    <w:p>
+      <w:pPr>
+        <w:jc w:val="both"/>
+        <w:rPr>
+          <w:b/>
+          <w:bCs/>
+          <w:color w:val="D86DCB" w:themeColor="accent5" w:themeTint="99"/>
+          <w:sz w:val="36"/>
+          <w:szCs w:val="36"/>
+        </w:rPr>
+      </w:pPr>
+      <w:r>
+        <w:rPr>
+          <w:b/>
+          <w:bCs/>
+          <w:color w:val="D86DCB" w:themeColor="accent5" w:themeTint="99"/>
+          <w:sz w:val="36"/>
+          <w:szCs w:val="36"/>
+        </w:rPr>
+        <w:t>@UIApplicationMain</w:t>
+      </w:r>
+    </w:p>
+    <w:p>
+      <w:pPr>
+        <w:jc w:val="both"/>
+        <w:rPr>
+          <w:b/>
+          <w:bCs/>
+          <w:color w:val="D86DCB" w:themeColor="accent5" w:themeTint="99"/>
+          <w:sz w:val="36"/>
+          <w:szCs w:val="36"/>
+        </w:rPr>
+      </w:pPr>
+      <w:r>
+        <w:rPr>
+          <w:b/>
+          <w:bCs/>
+          <w:color w:val="D86DCB" w:themeColor="accent5" w:themeTint="99"/>
+          <w:sz w:val="36"/>
+          <w:szCs w:val="36"/>
+        </w:rPr>
+        <w:t xml:space="preserve">@objc class </w:t>
+      </w:r>
+      <w:proofErr w:type="spellStart"/>
+      <w:r>
+        <w:rPr>
+          <w:b/>
+          <w:bCs/>
+          <w:color w:val="D86DCB" w:themeColor="accent5" w:themeTint="99"/>
+          <w:sz w:val="36"/>
+          <w:szCs w:val="36"/>
+        </w:rPr>
+        <w:t>AppDelegate</w:t>
+      </w:r>
+      <w:proofErr w:type="spellEnd"/>
+      <w:r>
+        <w:rPr>
+          <w:b/>
+          <w:bCs/>
+          <w:color w:val="D86DCB" w:themeColor="accent5" w:themeTint="99"/>
+          <w:sz w:val="36"/>
+          <w:szCs w:val="36"/>
+        </w:rPr>
+        <w:t xml:space="preserve">: </w:t>
+      </w:r>
+      <w:proofErr w:type="spellStart"/>
+      <w:r>
+        <w:rPr>
+          <w:b/>
+          <w:bCs/>
+          <w:color w:val="D86DCB" w:themeColor="accent5" w:themeTint="99"/>
+          <w:sz w:val="36"/>
+          <w:szCs w:val="36"/>
+        </w:rPr>
+        <w:t>FlutterAppDelegate</w:t>
+      </w:r>
+      <w:proofErr w:type="spellEnd"/>
+      <w:r>
+        <w:rPr>
+          <w:b/>
+          <w:bCs/>
+          <w:color w:val="D86DCB" w:themeColor="accent5" w:themeTint="99"/>
+          <w:sz w:val="36"/>
+          <w:szCs w:val="36"/>
+        </w:rPr>
+        <w:t xml:space="preserve"> {</w:t>
+      </w:r>
+    </w:p>
+    <w:p>
+      <w:pPr>
+        <w:jc w:val="both"/>
+        <w:rPr>
+          <w:b/>
+          <w:bCs/>
+          <w:color w:val="D86DCB" w:themeColor="accent5" w:themeTint="99"/>
+          <w:sz w:val="36"/>
+          <w:szCs w:val="36"/>
+        </w:rPr>
+      </w:pPr>
+      <w:r>
+        <w:rPr>
+          <w:b/>
+          <w:bCs/>
+          <w:color w:val="D86DCB" w:themeColor="accent5" w:themeTint="99"/>
+          <w:sz w:val="36"/>
+          <w:szCs w:val="36"/>
+        </w:rPr>
+        <w:t xml:space="preserve">  override </w:t>
+      </w:r>
+      <w:proofErr w:type="spellStart"/>
+      <w:r>
+        <w:rPr>
+          <w:b/>
+          <w:bCs/>
+          <w:color w:val="D86DCB" w:themeColor="accent5" w:themeTint="99"/>
+          <w:sz w:val="36"/>
+          <w:szCs w:val="36"/>
+        </w:rPr>
+        <w:t>func</w:t>
+      </w:r>
+      <w:proofErr w:type="spellEnd"/>
+      <w:r>
+        <w:rPr>
+          <w:b/>
+          <w:bCs/>
+          <w:color w:val="D86DCB" w:themeColor="accent5" w:themeTint="99"/>
+          <w:sz w:val="36"/>
+          <w:szCs w:val="36"/>
+        </w:rPr>
+        <w:t xml:space="preserve"> </w:t>
       </w:r>
       <w:proofErr w:type="gramStart"/>
       <w:r>
@@ -1501,148 +2050,283 @@
           <w:sz w:val="36"/>
           <w:szCs w:val="36"/>
         </w:rPr>
-        <w:t>&lt;!--</w:t>
+        <w:t>application(</w:t>
       </w:r>
       <w:proofErr w:type="gramEnd"/>
-      <w:r>
-        <w:rPr>
-          <w:b/>
-          <w:bCs/>
-          <w:color w:val="D86DCB" w:themeColor="accent5" w:themeTint="99"/>
-          <w:sz w:val="36"/>
-          <w:szCs w:val="36"/>
-        </w:rPr>
-        <w:t xml:space="preserve"> added for google maps API key --&gt;</w:t>
-      </w:r>
-    </w:p>
-    <w:p>
-      <w:pPr>
-        <w:jc w:val="both"/>
-        <w:rPr>
-          <w:b/>
-          <w:bCs/>
-          <w:color w:val="D86DCB" w:themeColor="accent5" w:themeTint="99"/>
-          <w:sz w:val="36"/>
-          <w:szCs w:val="36"/>
-        </w:rPr>
-      </w:pPr>
-      <w:r>
-        <w:rPr>
-          <w:b/>
-          <w:bCs/>
-          <w:color w:val="D86DCB" w:themeColor="accent5" w:themeTint="99"/>
-          <w:sz w:val="36"/>
-          <w:szCs w:val="36"/>
-        </w:rPr>
-        <w:t xml:space="preserve">        &lt;meta-data </w:t>
-      </w:r>
-      <w:proofErr w:type="spellStart"/>
-      <w:r>
-        <w:rPr>
-          <w:b/>
-          <w:bCs/>
-          <w:color w:val="D86DCB" w:themeColor="accent5" w:themeTint="99"/>
-          <w:sz w:val="36"/>
-          <w:szCs w:val="36"/>
-        </w:rPr>
-        <w:t>android:name</w:t>
-      </w:r>
-      <w:proofErr w:type="spellEnd"/>
-      <w:r>
-        <w:rPr>
-          <w:b/>
-          <w:bCs/>
-          <w:color w:val="D86DCB" w:themeColor="accent5" w:themeTint="99"/>
-          <w:sz w:val="36"/>
-          <w:szCs w:val="36"/>
-        </w:rPr>
-        <w:t>="</w:t>
-      </w:r>
-      <w:proofErr w:type="spellStart"/>
-      <w:r>
-        <w:rPr>
-          <w:b/>
-          <w:bCs/>
-          <w:color w:val="D86DCB" w:themeColor="accent5" w:themeTint="99"/>
-          <w:sz w:val="36"/>
-          <w:szCs w:val="36"/>
-        </w:rPr>
-        <w:t>com.google.android.geo.API_KEY</w:t>
-      </w:r>
-      <w:proofErr w:type="spellEnd"/>
-      <w:r>
-        <w:rPr>
-          <w:b/>
-          <w:bCs/>
-          <w:color w:val="D86DCB" w:themeColor="accent5" w:themeTint="99"/>
-          <w:sz w:val="36"/>
-          <w:szCs w:val="36"/>
-        </w:rPr>
-        <w:t>"</w:t>
-      </w:r>
-    </w:p>
-    <w:p>
-      <w:pPr>
-        <w:jc w:val="both"/>
-        <w:rPr>
-          <w:b/>
-          <w:bCs/>
-          <w:color w:val="D86DCB" w:themeColor="accent5" w:themeTint="99"/>
-          <w:sz w:val="36"/>
-          <w:szCs w:val="36"/>
-        </w:rPr>
-      </w:pPr>
-      <w:r>
-        <w:rPr>
-          <w:b/>
-          <w:bCs/>
-          <w:color w:val="D86DCB" w:themeColor="accent5" w:themeTint="99"/>
-          <w:sz w:val="36"/>
-          <w:szCs w:val="36"/>
-        </w:rPr>
-        <w:t xml:space="preserve">            </w:t>
-      </w:r>
-      <w:proofErr w:type="spellStart"/>
-      <w:r>
-        <w:rPr>
-          <w:b/>
-          <w:bCs/>
-          <w:color w:val="D86DCB" w:themeColor="accent5" w:themeTint="99"/>
-          <w:sz w:val="36"/>
-          <w:szCs w:val="36"/>
-        </w:rPr>
-        <w:t>android:value</w:t>
-      </w:r>
-      <w:proofErr w:type="spellEnd"/>
-      <w:r>
-        <w:rPr>
-          <w:b/>
-          <w:bCs/>
-          <w:color w:val="D86DCB" w:themeColor="accent5" w:themeTint="99"/>
-          <w:sz w:val="36"/>
-          <w:szCs w:val="36"/>
-        </w:rPr>
-        <w:t>="</w:t>
-      </w:r>
-      <w:r>
-        <w:rPr>
-          <w:b/>
-          <w:bCs/>
-          <w:color w:val="D86DCB" w:themeColor="accent5" w:themeTint="99"/>
-          <w:sz w:val="36"/>
-          <w:szCs w:val="36"/>
-        </w:rPr>
-        <w:t>Our API KEY</w:t>
-      </w:r>
-      <w:r>
-        <w:rPr>
-          <w:b/>
-          <w:bCs/>
-          <w:color w:val="D86DCB" w:themeColor="accent5" w:themeTint="99"/>
-          <w:sz w:val="36"/>
-          <w:szCs w:val="36"/>
-        </w:rPr>
-        <w:t xml:space="preserve">"/&gt; </w:t>
+    </w:p>
+    <w:p>
+      <w:pPr>
+        <w:jc w:val="both"/>
+        <w:rPr>
+          <w:b/>
+          <w:bCs/>
+          <w:color w:val="D86DCB" w:themeColor="accent5" w:themeTint="99"/>
+          <w:sz w:val="36"/>
+          <w:szCs w:val="36"/>
+        </w:rPr>
+      </w:pPr>
+      <w:r>
+        <w:rPr>
+          <w:b/>
+          <w:bCs/>
+          <w:color w:val="D86DCB" w:themeColor="accent5" w:themeTint="99"/>
+          <w:sz w:val="36"/>
+          <w:szCs w:val="36"/>
+        </w:rPr>
+        <w:t xml:space="preserve">    _ application: </w:t>
+      </w:r>
+      <w:proofErr w:type="spellStart"/>
+      <w:r>
+        <w:rPr>
+          <w:b/>
+          <w:bCs/>
+          <w:color w:val="D86DCB" w:themeColor="accent5" w:themeTint="99"/>
+          <w:sz w:val="36"/>
+          <w:szCs w:val="36"/>
+        </w:rPr>
+        <w:t>UIApplication</w:t>
+      </w:r>
+      <w:proofErr w:type="spellEnd"/>
+      <w:r>
+        <w:rPr>
+          <w:b/>
+          <w:bCs/>
+          <w:color w:val="D86DCB" w:themeColor="accent5" w:themeTint="99"/>
+          <w:sz w:val="36"/>
+          <w:szCs w:val="36"/>
+        </w:rPr>
+        <w:t>,</w:t>
+      </w:r>
+    </w:p>
+    <w:p>
+      <w:pPr>
+        <w:jc w:val="both"/>
+        <w:rPr>
+          <w:b/>
+          <w:bCs/>
+          <w:color w:val="D86DCB" w:themeColor="accent5" w:themeTint="99"/>
+          <w:sz w:val="36"/>
+          <w:szCs w:val="36"/>
+        </w:rPr>
+      </w:pPr>
+      <w:r>
+        <w:rPr>
+          <w:b/>
+          <w:bCs/>
+          <w:color w:val="D86DCB" w:themeColor="accent5" w:themeTint="99"/>
+          <w:sz w:val="36"/>
+          <w:szCs w:val="36"/>
+        </w:rPr>
+        <w:t xml:space="preserve">    </w:t>
+      </w:r>
+      <w:proofErr w:type="spellStart"/>
+      <w:r>
+        <w:rPr>
+          <w:b/>
+          <w:bCs/>
+          <w:color w:val="D86DCB" w:themeColor="accent5" w:themeTint="99"/>
+          <w:sz w:val="36"/>
+          <w:szCs w:val="36"/>
+        </w:rPr>
+        <w:t>didFinishLaunchingWithOptions</w:t>
+      </w:r>
+      <w:proofErr w:type="spellEnd"/>
+      <w:r>
+        <w:rPr>
+          <w:b/>
+          <w:bCs/>
+          <w:color w:val="D86DCB" w:themeColor="accent5" w:themeTint="99"/>
+          <w:sz w:val="36"/>
+          <w:szCs w:val="36"/>
+        </w:rPr>
+        <w:t xml:space="preserve"> </w:t>
+      </w:r>
+      <w:proofErr w:type="spellStart"/>
+      <w:r>
+        <w:rPr>
+          <w:b/>
+          <w:bCs/>
+          <w:color w:val="D86DCB" w:themeColor="accent5" w:themeTint="99"/>
+          <w:sz w:val="36"/>
+          <w:szCs w:val="36"/>
+        </w:rPr>
+        <w:t>launchOptions</w:t>
+      </w:r>
+      <w:proofErr w:type="spellEnd"/>
+      <w:r>
+        <w:rPr>
+          <w:b/>
+          <w:bCs/>
+          <w:color w:val="D86DCB" w:themeColor="accent5" w:themeTint="99"/>
+          <w:sz w:val="36"/>
+          <w:szCs w:val="36"/>
+        </w:rPr>
+        <w:t>: [</w:t>
+      </w:r>
+      <w:proofErr w:type="spellStart"/>
+      <w:r>
+        <w:rPr>
+          <w:b/>
+          <w:bCs/>
+          <w:color w:val="D86DCB" w:themeColor="accent5" w:themeTint="99"/>
+          <w:sz w:val="36"/>
+          <w:szCs w:val="36"/>
+        </w:rPr>
+        <w:t>UIApplication.LaunchOptionsKey</w:t>
+      </w:r>
+      <w:proofErr w:type="spellEnd"/>
+      <w:r>
+        <w:rPr>
+          <w:b/>
+          <w:bCs/>
+          <w:color w:val="D86DCB" w:themeColor="accent5" w:themeTint="99"/>
+          <w:sz w:val="36"/>
+          <w:szCs w:val="36"/>
+        </w:rPr>
+        <w:t>: Any]?</w:t>
+      </w:r>
+    </w:p>
+    <w:p>
+      <w:pPr>
+        <w:jc w:val="both"/>
+        <w:rPr>
+          <w:b/>
+          <w:bCs/>
+          <w:color w:val="D86DCB" w:themeColor="accent5" w:themeTint="99"/>
+          <w:sz w:val="36"/>
+          <w:szCs w:val="36"/>
+        </w:rPr>
+      </w:pPr>
+      <w:r>
+        <w:rPr>
+          <w:b/>
+          <w:bCs/>
+          <w:color w:val="D86DCB" w:themeColor="accent5" w:themeTint="99"/>
+          <w:sz w:val="36"/>
+          <w:szCs w:val="36"/>
+        </w:rPr>
+        <w:t xml:space="preserve">  ) -&gt; Bool {</w:t>
+      </w:r>
+    </w:p>
+    <w:p>
+      <w:pPr>
+        <w:jc w:val="both"/>
+        <w:rPr>
+          <w:b/>
+          <w:bCs/>
+          <w:color w:val="D86DCB" w:themeColor="accent5" w:themeTint="99"/>
+          <w:sz w:val="36"/>
+          <w:szCs w:val="36"/>
+        </w:rPr>
+      </w:pPr>
+      <w:r>
+        <w:rPr>
+          <w:b/>
+          <w:bCs/>
+          <w:color w:val="D86DCB" w:themeColor="accent5" w:themeTint="99"/>
+          <w:sz w:val="36"/>
+          <w:szCs w:val="36"/>
+        </w:rPr>
+        <w:t xml:space="preserve">    </w:t>
+      </w:r>
+      <w:proofErr w:type="spellStart"/>
+      <w:r>
+        <w:rPr>
+          <w:b/>
+          <w:bCs/>
+          <w:color w:val="D86DCB" w:themeColor="accent5" w:themeTint="99"/>
+          <w:sz w:val="36"/>
+          <w:szCs w:val="36"/>
+        </w:rPr>
+        <w:t>GMSServices.provideAPIKey</w:t>
+      </w:r>
+      <w:proofErr w:type="spellEnd"/>
+      <w:r>
+        <w:rPr>
+          <w:b/>
+          <w:bCs/>
+          <w:color w:val="D86DCB" w:themeColor="accent5" w:themeTint="99"/>
+          <w:sz w:val="36"/>
+          <w:szCs w:val="36"/>
+        </w:rPr>
+        <w:t>("Our API KEY") // Add the API key here</w:t>
+      </w:r>
+    </w:p>
+    <w:p>
+      <w:pPr>
+        <w:jc w:val="both"/>
+        <w:rPr>
+          <w:b/>
+          <w:bCs/>
+          <w:color w:val="D86DCB" w:themeColor="accent5" w:themeTint="99"/>
+          <w:sz w:val="36"/>
+          <w:szCs w:val="36"/>
+        </w:rPr>
+      </w:pPr>
+      <w:r>
+        <w:rPr>
+          <w:b/>
+          <w:bCs/>
+          <w:color w:val="D86DCB" w:themeColor="accent5" w:themeTint="99"/>
+          <w:sz w:val="36"/>
+          <w:szCs w:val="36"/>
+        </w:rPr>
+        <w:t xml:space="preserve">    </w:t>
+      </w:r>
+      <w:proofErr w:type="spellStart"/>
+      <w:r>
+        <w:rPr>
+          <w:b/>
+          <w:bCs/>
+          <w:color w:val="D86DCB" w:themeColor="accent5" w:themeTint="99"/>
+          <w:sz w:val="36"/>
+          <w:szCs w:val="36"/>
+        </w:rPr>
+        <w:t>GeneratedPluginRegistrant.register</w:t>
+      </w:r>
+      <w:proofErr w:type="spellEnd"/>
+      <w:r>
+        <w:rPr>
+          <w:b/>
+          <w:bCs/>
+          <w:color w:val="D86DCB" w:themeColor="accent5" w:themeTint="99"/>
+          <w:sz w:val="36"/>
+          <w:szCs w:val="36"/>
+        </w:rPr>
+        <w:t>(with: self)</w:t>
+      </w:r>
+    </w:p>
+    <w:p>
+      <w:pPr>
+        <w:jc w:val="both"/>
+        <w:rPr>
+          <w:b/>
+          <w:bCs/>
+          <w:color w:val="D86DCB" w:themeColor="accent5" w:themeTint="99"/>
+          <w:sz w:val="36"/>
+          <w:szCs w:val="36"/>
+        </w:rPr>
+      </w:pPr>
+      <w:r>
+        <w:rPr>
+          <w:b/>
+          <w:bCs/>
+          <w:color w:val="D86DCB" w:themeColor="accent5" w:themeTint="99"/>
+          <w:sz w:val="36"/>
+          <w:szCs w:val="36"/>
+        </w:rPr>
+        <w:t xml:space="preserve">    return </w:t>
+      </w:r>
+      <w:proofErr w:type="spellStart"/>
+      <w:r>
+        <w:rPr>
+          <w:b/>
+          <w:bCs/>
+          <w:color w:val="D86DCB" w:themeColor="accent5" w:themeTint="99"/>
+          <w:sz w:val="36"/>
+          <w:szCs w:val="36"/>
+        </w:rPr>
+        <w:t>super.</w:t>
       </w:r>
       <w:proofErr w:type="gramStart"/>
       <w:r>
@@ -1653,7 +2337,18 @@
           <w:sz w:val="36"/>
           <w:szCs w:val="36"/>
         </w:rPr>
-        <w:t>&lt;!--</w:t>
+        <w:t>application</w:t>
+      </w:r>
+      <w:proofErr w:type="spellEnd"/>
+      <w:r>
+        <w:rPr>
+          <w:b/>
+          <w:bCs/>
+          <w:color w:val="D86DCB" w:themeColor="accent5" w:themeTint="99"/>
+          <w:sz w:val="36"/>
+          <w:szCs w:val="36"/>
+        </w:rPr>
+        <w:t>(</w:t>
       </w:r>
       <w:proofErr w:type="gramEnd"/>
       <w:r>
@@ -1664,7 +2359,51 @@
           <w:sz w:val="36"/>
           <w:szCs w:val="36"/>
         </w:rPr>
-        <w:t xml:space="preserve"> add the API key here --&gt;</w:t>
+        <w:t xml:space="preserve">application, </w:t>
+      </w:r>
+      <w:proofErr w:type="spellStart"/>
+      <w:r>
+        <w:rPr>
+          <w:b/>
+          <w:bCs/>
+          <w:color w:val="D86DCB" w:themeColor="accent5" w:themeTint="99"/>
+          <w:sz w:val="36"/>
+          <w:szCs w:val="36"/>
+        </w:rPr>
+        <w:t>didFinishLaunchingWithOptions</w:t>
+      </w:r>
+      <w:proofErr w:type="spellEnd"/>
+      <w:r>
+        <w:rPr>
+          <w:b/>
+          <w:bCs/>
+          <w:color w:val="D86DCB" w:themeColor="accent5" w:themeTint="99"/>
+          <w:sz w:val="36"/>
+          <w:szCs w:val="36"/>
+        </w:rPr>
+        <w:t xml:space="preserve">: </w:t>
+      </w:r>
+      <w:proofErr w:type="spellStart"/>
+      <w:r>
+        <w:rPr>
+          <w:b/>
+          <w:bCs/>
+          <w:color w:val="D86DCB" w:themeColor="accent5" w:themeTint="99"/>
+          <w:sz w:val="36"/>
+          <w:szCs w:val="36"/>
+        </w:rPr>
+        <w:t>launchOptions</w:t>
+      </w:r>
+      <w:proofErr w:type="spellEnd"/>
+      <w:r>
+        <w:rPr>
+          <w:b/>
+          <w:bCs/>
+          <w:color w:val="D86DCB" w:themeColor="accent5" w:themeTint="99"/>
+          <w:sz w:val="36"/>
+          <w:szCs w:val="36"/>
+        </w:rPr>
+        <w:t>)</w:t>
       </w:r>
     </w:p>
     <w:p>
@@ -1687,611 +2426,428 @@
           <w:szCs w:val="36"/>
         </w:rPr>
         <w:lastRenderedPageBreak/>
-        <w:t xml:space="preserve">        &lt;activity</w:t>
-      </w:r>
-    </w:p>
-    <w:p>
-      <w:pPr>
-        <w:jc w:val="both"/>
-        <w:rPr>
-          <w:sz w:val="36"/>
-          <w:szCs w:val="36"/>
-        </w:rPr>
-      </w:pPr>
-    </w:p>
-    <w:p>
-      <w:pPr>
-        <w:jc w:val="both"/>
-        <w:rPr>
-          <w:sz w:val="36"/>
-          <w:szCs w:val="36"/>
-        </w:rPr>
-      </w:pPr>
-      <w:r>
-        <w:rPr>
-          <w:sz w:val="36"/>
-          <w:szCs w:val="36"/>
-        </w:rPr>
-        <w:t xml:space="preserve"># For iOS, go to </w:t>
-      </w:r>
-      <w:proofErr w:type="spellStart"/>
-      <w:r>
-        <w:rPr>
-          <w:b/>
-          <w:bCs/>
-          <w:sz w:val="36"/>
-          <w:szCs w:val="36"/>
-        </w:rPr>
-        <w:t>project_root</w:t>
-      </w:r>
-      <w:proofErr w:type="spellEnd"/>
-      <w:r>
-        <w:rPr>
-          <w:b/>
-          <w:bCs/>
-          <w:sz w:val="36"/>
-          <w:szCs w:val="36"/>
-        </w:rPr>
-        <w:t>/</w:t>
-      </w:r>
-      <w:proofErr w:type="spellStart"/>
-      <w:r>
-        <w:rPr>
-          <w:b/>
-          <w:bCs/>
-          <w:sz w:val="36"/>
-          <w:szCs w:val="36"/>
-        </w:rPr>
-        <w:t>ios</w:t>
-      </w:r>
-      <w:proofErr w:type="spellEnd"/>
-      <w:r>
-        <w:rPr>
-          <w:b/>
-          <w:bCs/>
-          <w:sz w:val="36"/>
-          <w:szCs w:val="36"/>
-        </w:rPr>
-        <w:t>/runner/</w:t>
-      </w:r>
-      <w:proofErr w:type="spellStart"/>
-      <w:r>
-        <w:rPr>
-          <w:b/>
-          <w:bCs/>
-          <w:sz w:val="36"/>
-          <w:szCs w:val="36"/>
-        </w:rPr>
-        <w:t>AppDelegate.swift</w:t>
-      </w:r>
-      <w:proofErr w:type="spellEnd"/>
-      <w:r>
-        <w:rPr>
-          <w:sz w:val="36"/>
-          <w:szCs w:val="36"/>
-        </w:rPr>
-        <w:t xml:space="preserve"> and add these codes:</w:t>
-      </w:r>
-    </w:p>
-    <w:p>
-      <w:pPr>
-        <w:jc w:val="both"/>
-        <w:rPr>
-          <w:b/>
-          <w:bCs/>
-          <w:color w:val="D86DCB" w:themeColor="accent5" w:themeTint="99"/>
-          <w:sz w:val="36"/>
-          <w:szCs w:val="36"/>
-        </w:rPr>
-      </w:pPr>
-      <w:r>
-        <w:rPr>
-          <w:b/>
-          <w:bCs/>
-          <w:color w:val="D86DCB" w:themeColor="accent5" w:themeTint="99"/>
-          <w:sz w:val="36"/>
-          <w:szCs w:val="36"/>
-        </w:rPr>
-        <w:t xml:space="preserve">import </w:t>
-      </w:r>
-      <w:proofErr w:type="spellStart"/>
-      <w:r>
-        <w:rPr>
-          <w:b/>
-          <w:bCs/>
-          <w:color w:val="D86DCB" w:themeColor="accent5" w:themeTint="99"/>
-          <w:sz w:val="36"/>
-          <w:szCs w:val="36"/>
-        </w:rPr>
-        <w:t>UIKit</w:t>
-      </w:r>
-      <w:proofErr w:type="spellEnd"/>
-    </w:p>
-    <w:p>
-      <w:pPr>
-        <w:jc w:val="both"/>
-        <w:rPr>
-          <w:b/>
-          <w:bCs/>
-          <w:color w:val="D86DCB" w:themeColor="accent5" w:themeTint="99"/>
-          <w:sz w:val="36"/>
-          <w:szCs w:val="36"/>
-        </w:rPr>
-      </w:pPr>
-      <w:r>
-        <w:rPr>
-          <w:b/>
-          <w:bCs/>
-          <w:color w:val="D86DCB" w:themeColor="accent5" w:themeTint="99"/>
-          <w:sz w:val="36"/>
-          <w:szCs w:val="36"/>
-        </w:rPr>
-        <w:t>import Flutter</w:t>
-      </w:r>
-    </w:p>
-    <w:p>
-      <w:pPr>
-        <w:jc w:val="both"/>
-        <w:rPr>
-          <w:b/>
-          <w:bCs/>
-          <w:color w:val="D86DCB" w:themeColor="accent5" w:themeTint="99"/>
-          <w:sz w:val="36"/>
-          <w:szCs w:val="36"/>
-        </w:rPr>
-      </w:pPr>
-      <w:r>
-        <w:rPr>
-          <w:b/>
-          <w:bCs/>
-          <w:color w:val="D86DCB" w:themeColor="accent5" w:themeTint="99"/>
-          <w:sz w:val="36"/>
-          <w:szCs w:val="36"/>
-        </w:rPr>
-        <w:t xml:space="preserve">import </w:t>
-      </w:r>
-      <w:proofErr w:type="spellStart"/>
-      <w:r>
-        <w:rPr>
-          <w:b/>
-          <w:bCs/>
-          <w:color w:val="D86DCB" w:themeColor="accent5" w:themeTint="99"/>
-          <w:sz w:val="36"/>
-          <w:szCs w:val="36"/>
-        </w:rPr>
-        <w:t>GoogleMaps</w:t>
-      </w:r>
-      <w:proofErr w:type="spellEnd"/>
-    </w:p>
-    <w:p>
-      <w:pPr>
-        <w:jc w:val="both"/>
-        <w:rPr>
-          <w:b/>
-          <w:bCs/>
-          <w:color w:val="D86DCB" w:themeColor="accent5" w:themeTint="99"/>
-          <w:sz w:val="36"/>
-          <w:szCs w:val="36"/>
-        </w:rPr>
-      </w:pPr>
-    </w:p>
-    <w:p>
-      <w:pPr>
-        <w:jc w:val="both"/>
-        <w:rPr>
-          <w:b/>
-          <w:bCs/>
-          <w:color w:val="D86DCB" w:themeColor="accent5" w:themeTint="99"/>
-          <w:sz w:val="36"/>
-          <w:szCs w:val="36"/>
-        </w:rPr>
-      </w:pPr>
-      <w:r>
-        <w:rPr>
-          <w:b/>
-          <w:bCs/>
-          <w:color w:val="D86DCB" w:themeColor="accent5" w:themeTint="99"/>
-          <w:sz w:val="36"/>
-          <w:szCs w:val="36"/>
-        </w:rPr>
-        <w:t>@UIApplicationMain</w:t>
-      </w:r>
-    </w:p>
-    <w:p>
-      <w:pPr>
-        <w:jc w:val="both"/>
-        <w:rPr>
-          <w:b/>
-          <w:bCs/>
-          <w:color w:val="D86DCB" w:themeColor="accent5" w:themeTint="99"/>
-          <w:sz w:val="36"/>
-          <w:szCs w:val="36"/>
-        </w:rPr>
-      </w:pPr>
-      <w:r>
-        <w:rPr>
-          <w:b/>
-          <w:bCs/>
-          <w:color w:val="D86DCB" w:themeColor="accent5" w:themeTint="99"/>
-          <w:sz w:val="36"/>
-          <w:szCs w:val="36"/>
-        </w:rPr>
-        <w:t xml:space="preserve">@objc class </w:t>
-      </w:r>
-      <w:proofErr w:type="spellStart"/>
-      <w:r>
-        <w:rPr>
-          <w:b/>
-          <w:bCs/>
-          <w:color w:val="D86DCB" w:themeColor="accent5" w:themeTint="99"/>
-          <w:sz w:val="36"/>
-          <w:szCs w:val="36"/>
-        </w:rPr>
-        <w:t>AppDelegate</w:t>
-      </w:r>
-      <w:proofErr w:type="spellEnd"/>
-      <w:r>
-        <w:rPr>
-          <w:b/>
-          <w:bCs/>
-          <w:color w:val="D86DCB" w:themeColor="accent5" w:themeTint="99"/>
-          <w:sz w:val="36"/>
-          <w:szCs w:val="36"/>
-        </w:rPr>
-        <w:t xml:space="preserve">: </w:t>
-      </w:r>
-      <w:proofErr w:type="spellStart"/>
-      <w:r>
-        <w:rPr>
-          <w:b/>
-          <w:bCs/>
-          <w:color w:val="D86DCB" w:themeColor="accent5" w:themeTint="99"/>
-          <w:sz w:val="36"/>
-          <w:szCs w:val="36"/>
-        </w:rPr>
-        <w:t>FlutterAppDelegate</w:t>
-      </w:r>
-      <w:proofErr w:type="spellEnd"/>
-      <w:r>
-        <w:rPr>
-          <w:b/>
-          <w:bCs/>
-          <w:color w:val="D86DCB" w:themeColor="accent5" w:themeTint="99"/>
-          <w:sz w:val="36"/>
-          <w:szCs w:val="36"/>
-        </w:rPr>
-        <w:t xml:space="preserve"> {</w:t>
-      </w:r>
-    </w:p>
-    <w:p>
-      <w:pPr>
-        <w:jc w:val="both"/>
-        <w:rPr>
-          <w:b/>
-          <w:bCs/>
-          <w:color w:val="D86DCB" w:themeColor="accent5" w:themeTint="99"/>
-          <w:sz w:val="36"/>
-          <w:szCs w:val="36"/>
-        </w:rPr>
-      </w:pPr>
-      <w:r>
-        <w:rPr>
-          <w:b/>
-          <w:bCs/>
-          <w:color w:val="D86DCB" w:themeColor="accent5" w:themeTint="99"/>
-          <w:sz w:val="36"/>
-          <w:szCs w:val="36"/>
-        </w:rPr>
-        <w:t xml:space="preserve">  override </w:t>
-      </w:r>
-      <w:proofErr w:type="spellStart"/>
-      <w:r>
-        <w:rPr>
-          <w:b/>
-          <w:bCs/>
-          <w:color w:val="D86DCB" w:themeColor="accent5" w:themeTint="99"/>
-          <w:sz w:val="36"/>
-          <w:szCs w:val="36"/>
-        </w:rPr>
-        <w:t>func</w:t>
-      </w:r>
-      <w:proofErr w:type="spellEnd"/>
-      <w:r>
-        <w:rPr>
-          <w:b/>
-          <w:bCs/>
-          <w:color w:val="D86DCB" w:themeColor="accent5" w:themeTint="99"/>
+        <w:t xml:space="preserve">  }</w:t>
+      </w:r>
+    </w:p>
+    <w:p>
+      <w:pPr>
+        <w:jc w:val="both"/>
+        <w:rPr>
+          <w:b/>
+          <w:bCs/>
+          <w:color w:val="D86DCB" w:themeColor="accent5" w:themeTint="99"/>
+          <w:sz w:val="36"/>
+          <w:szCs w:val="36"/>
+        </w:rPr>
+      </w:pPr>
+      <w:r>
+        <w:rPr>
+          <w:b/>
+          <w:bCs/>
+          <w:color w:val="D86DCB" w:themeColor="accent5" w:themeTint="99"/>
+          <w:sz w:val="36"/>
+          <w:szCs w:val="36"/>
+        </w:rPr>
+        <w:t>}</w:t>
+      </w:r>
+    </w:p>
+    <w:p>
+      <w:pPr>
+        <w:jc w:val="both"/>
+        <w:rPr>
+          <w:sz w:val="36"/>
+          <w:szCs w:val="36"/>
+        </w:rPr>
+      </w:pPr>
+    </w:p>
+    <w:p>
+      <w:pPr>
+        <w:jc w:val="both"/>
+        <w:rPr>
+          <w:sz w:val="36"/>
+          <w:szCs w:val="36"/>
+        </w:rPr>
+      </w:pPr>
+      <w:r>
+        <w:rPr>
+          <w:sz w:val="36"/>
+          <w:szCs w:val="36"/>
+        </w:rPr>
+        <w:t>Usage:</w:t>
+      </w:r>
+    </w:p>
+    <w:p>
+      <w:pPr>
+        <w:jc w:val="both"/>
+        <w:rPr>
+          <w:sz w:val="36"/>
+          <w:szCs w:val="36"/>
+        </w:rPr>
+      </w:pPr>
+      <w:r>
+        <w:rPr>
+          <w:sz w:val="36"/>
+          <w:szCs w:val="36"/>
+        </w:rPr>
+        <w:t xml:space="preserve"># </w:t>
+      </w:r>
+      <w:r>
+        <w:rPr>
+          <w:sz w:val="36"/>
+          <w:szCs w:val="36"/>
+        </w:rPr>
+        <w:t>Go to</w:t>
+      </w:r>
+      <w:r>
+        <w:rPr>
+          <w:b/>
+          <w:bCs/>
           <w:sz w:val="36"/>
           <w:szCs w:val="36"/>
         </w:rPr>
         <w:t xml:space="preserve"> </w:t>
       </w:r>
+      <w:proofErr w:type="spellStart"/>
       <w:proofErr w:type="gramStart"/>
       <w:r>
         <w:rPr>
           <w:b/>
           <w:bCs/>
-          <w:color w:val="D86DCB" w:themeColor="accent5" w:themeTint="99"/>
-          <w:sz w:val="36"/>
-          <w:szCs w:val="36"/>
-        </w:rPr>
-        <w:t>application(</w:t>
-      </w:r>
+          <w:sz w:val="36"/>
+          <w:szCs w:val="36"/>
+        </w:rPr>
+        <w:t>main.dart</w:t>
+      </w:r>
+      <w:proofErr w:type="spellEnd"/>
       <w:proofErr w:type="gramEnd"/>
-    </w:p>
-    <w:p>
-      <w:pPr>
-        <w:jc w:val="both"/>
-        <w:rPr>
-          <w:b/>
-          <w:bCs/>
-          <w:color w:val="D86DCB" w:themeColor="accent5" w:themeTint="99"/>
-          <w:sz w:val="36"/>
-          <w:szCs w:val="36"/>
-        </w:rPr>
-      </w:pPr>
-      <w:r>
-        <w:rPr>
-          <w:b/>
-          <w:bCs/>
-          <w:color w:val="D86DCB" w:themeColor="accent5" w:themeTint="99"/>
-          <w:sz w:val="36"/>
-          <w:szCs w:val="36"/>
-        </w:rPr>
-        <w:t xml:space="preserve">    _ application: </w:t>
-      </w:r>
-      <w:proofErr w:type="spellStart"/>
-      <w:r>
-        <w:rPr>
-          <w:b/>
-          <w:bCs/>
-          <w:color w:val="D86DCB" w:themeColor="accent5" w:themeTint="99"/>
-          <w:sz w:val="36"/>
-          <w:szCs w:val="36"/>
-        </w:rPr>
-        <w:t>UIApplication</w:t>
-      </w:r>
-      <w:proofErr w:type="spellEnd"/>
-      <w:r>
-        <w:rPr>
-          <w:b/>
-          <w:bCs/>
-          <w:color w:val="D86DCB" w:themeColor="accent5" w:themeTint="99"/>
+      <w:r>
+        <w:rPr>
+          <w:sz w:val="36"/>
+          <w:szCs w:val="36"/>
+        </w:rPr>
+        <w:t xml:space="preserve"> and make sure to add the below codes </w:t>
+      </w:r>
+      <w:r>
+        <w:rPr>
+          <w:sz w:val="36"/>
+          <w:szCs w:val="36"/>
+        </w:rPr>
+        <w:t>be</w:t>
+      </w:r>
+      <w:r>
+        <w:rPr>
+          <w:sz w:val="36"/>
+          <w:szCs w:val="36"/>
+        </w:rPr>
+        <w:t>cause some android devices (Low performance devices) needs it. MOST IMPORTAN</w:t>
+      </w:r>
+      <w:r>
+        <w:rPr>
+          <w:sz w:val="36"/>
+          <w:szCs w:val="36"/>
+        </w:rPr>
+        <w:t>T</w:t>
+      </w:r>
+      <w:r>
+        <w:rPr>
+          <w:sz w:val="36"/>
+          <w:szCs w:val="36"/>
+        </w:rPr>
+        <w:t xml:space="preserve"> if we are running the project on</w:t>
+      </w:r>
+      <w:r>
+        <w:rPr>
+          <w:sz w:val="36"/>
+          <w:szCs w:val="36"/>
+        </w:rPr>
+        <w:t xml:space="preserve"> </w:t>
+      </w:r>
+      <w:r>
+        <w:rPr>
+          <w:sz w:val="36"/>
+          <w:szCs w:val="36"/>
+        </w:rPr>
+        <w:t>emulator,</w:t>
+      </w:r>
+      <w:r>
+        <w:rPr>
+          <w:sz w:val="36"/>
+          <w:szCs w:val="36"/>
+        </w:rPr>
+        <w:t xml:space="preserve"> </w:t>
+      </w:r>
+      <w:r>
+        <w:rPr>
+          <w:sz w:val="36"/>
+          <w:szCs w:val="36"/>
+        </w:rPr>
+        <w:t>we need at least 1 GB custom RAM (By Default its 512 MB)</w:t>
+      </w:r>
+    </w:p>
+    <w:p>
+      <w:pPr>
+        <w:jc w:val="both"/>
+        <w:rPr>
+          <w:sz w:val="36"/>
+          <w:szCs w:val="36"/>
+        </w:rPr>
+      </w:pPr>
+      <w:r>
+        <w:rPr>
+          <w:sz w:val="36"/>
+          <w:szCs w:val="36"/>
+        </w:rPr>
+        <w:t># In this code, we</w:t>
+      </w:r>
+      <w:r>
+        <w:rPr>
+          <w:sz w:val="36"/>
+          <w:szCs w:val="36"/>
+        </w:rPr>
+        <w:t>’re</w:t>
+      </w:r>
+      <w:r>
+        <w:rPr>
+          <w:sz w:val="36"/>
+          <w:szCs w:val="36"/>
+        </w:rPr>
+        <w:t xml:space="preserve"> just </w:t>
+      </w:r>
+      <w:r>
+        <w:rPr>
+          <w:sz w:val="36"/>
+          <w:szCs w:val="36"/>
+        </w:rPr>
+        <w:t xml:space="preserve">creating an instance of </w:t>
+      </w:r>
+      <w:proofErr w:type="spellStart"/>
+      <w:r>
+        <w:rPr>
+          <w:b/>
+          <w:bCs/>
+          <w:sz w:val="36"/>
+          <w:szCs w:val="36"/>
+        </w:rPr>
+        <w:t>GoogleMapsFlutterPlatform</w:t>
+      </w:r>
+      <w:proofErr w:type="spellEnd"/>
+      <w:r>
+        <w:rPr>
+          <w:sz w:val="36"/>
+          <w:szCs w:val="36"/>
+        </w:rPr>
+        <w:t xml:space="preserve"> </w:t>
+      </w:r>
+      <w:proofErr w:type="gramStart"/>
+      <w:r>
+        <w:rPr>
+          <w:sz w:val="36"/>
+          <w:szCs w:val="36"/>
+        </w:rPr>
+        <w:t xml:space="preserve">using </w:t>
+      </w:r>
+      <w:r>
+        <w:rPr>
+          <w:b/>
+          <w:bCs/>
+          <w:sz w:val="36"/>
+          <w:szCs w:val="36"/>
+        </w:rPr>
+        <w:t>.instance</w:t>
+      </w:r>
+      <w:proofErr w:type="gramEnd"/>
+    </w:p>
+    <w:p>
+      <w:pPr>
+        <w:jc w:val="both"/>
+        <w:rPr>
+          <w:sz w:val="36"/>
+          <w:szCs w:val="36"/>
+        </w:rPr>
+      </w:pPr>
+      <w:r>
+        <w:rPr>
+          <w:sz w:val="36"/>
+          <w:szCs w:val="36"/>
+        </w:rPr>
+        <w:t># Then we’re checking it</w:t>
+      </w:r>
+      <w:r>
+        <w:rPr>
+          <w:sz w:val="36"/>
+          <w:szCs w:val="36"/>
+        </w:rPr>
+        <w:t xml:space="preserve">, if its running on android then set </w:t>
+      </w:r>
+      <w:proofErr w:type="gramStart"/>
+      <w:r>
+        <w:rPr>
+          <w:sz w:val="36"/>
+          <w:szCs w:val="36"/>
+        </w:rPr>
+        <w:t>the</w:t>
+      </w:r>
+      <w:r>
+        <w:rPr>
+          <w:b/>
+          <w:bCs/>
+          <w:sz w:val="36"/>
+          <w:szCs w:val="36"/>
+        </w:rPr>
+        <w:t xml:space="preserve"> </w:t>
+      </w:r>
+      <w:r>
+        <w:rPr>
+          <w:b/>
+          <w:bCs/>
+          <w:sz w:val="36"/>
+          <w:szCs w:val="36"/>
+        </w:rPr>
+        <w:t>.</w:t>
+      </w:r>
+      <w:proofErr w:type="spellStart"/>
+      <w:r>
+        <w:rPr>
+          <w:b/>
+          <w:bCs/>
+          <w:sz w:val="36"/>
+          <w:szCs w:val="36"/>
+        </w:rPr>
+        <w:t>userAndroidViewSurface</w:t>
+      </w:r>
+      <w:proofErr w:type="spellEnd"/>
+      <w:proofErr w:type="gramEnd"/>
+      <w:r>
+        <w:rPr>
+          <w:sz w:val="36"/>
+          <w:szCs w:val="36"/>
+        </w:rPr>
+        <w:t xml:space="preserve"> to </w:t>
+      </w:r>
+      <w:r>
+        <w:rPr>
+          <w:b/>
+          <w:bCs/>
+          <w:sz w:val="36"/>
+          <w:szCs w:val="36"/>
+        </w:rPr>
+        <w:t>true</w:t>
+      </w:r>
+      <w:r>
+        <w:rPr>
+          <w:sz w:val="36"/>
+          <w:szCs w:val="36"/>
+        </w:rPr>
+        <w:t>. This makes the map more stable on some android devices</w:t>
+      </w:r>
+    </w:p>
+    <w:p>
+      <w:pPr>
+        <w:jc w:val="both"/>
+        <w:rPr>
+          <w:sz w:val="36"/>
+          <w:szCs w:val="36"/>
+        </w:rPr>
+      </w:pPr>
+      <w:r>
+        <w:rPr>
+          <w:sz w:val="36"/>
+          <w:szCs w:val="36"/>
+        </w:rPr>
+        <w:t># Note</w:t>
+      </w:r>
+      <w:r>
+        <w:rPr>
           <w:sz w:val="36"/>
           <w:szCs w:val="36"/>
         </w:rPr>
         <w:t>,</w:t>
       </w:r>
-    </w:p>
-    <w:p>
-      <w:pPr>
-        <w:jc w:val="both"/>
-        <w:rPr>
-          <w:b/>
-          <w:bCs/>
-          <w:color w:val="D86DCB" w:themeColor="accent5" w:themeTint="99"/>
-          <w:sz w:val="36"/>
-          <w:szCs w:val="36"/>
-        </w:rPr>
-      </w:pPr>
-      <w:r>
-        <w:rPr>
-          <w:b/>
-          <w:bCs/>
-          <w:color w:val="D86DCB" w:themeColor="accent5" w:themeTint="99"/>
-          <w:sz w:val="36"/>
-          <w:szCs w:val="36"/>
-        </w:rPr>
-        <w:t xml:space="preserve">    </w:t>
-      </w:r>
-      <w:proofErr w:type="spellStart"/>
-      <w:r>
-        <w:rPr>
-          <w:b/>
-          <w:bCs/>
-          <w:color w:val="D86DCB" w:themeColor="accent5" w:themeTint="99"/>
-          <w:sz w:val="36"/>
-          <w:szCs w:val="36"/>
-        </w:rPr>
-        <w:t>didFinishLaunchingWithOptions</w:t>
-      </w:r>
-      <w:proofErr w:type="spellEnd"/>
-      <w:r>
-        <w:rPr>
-          <w:b/>
-          <w:bCs/>
-          <w:color w:val="D86DCB" w:themeColor="accent5" w:themeTint="99"/>
+      <w:r>
+        <w:rPr>
+          <w:sz w:val="36"/>
+          <w:szCs w:val="36"/>
+        </w:rPr>
+        <w:t xml:space="preserve"> we can also </w:t>
+      </w:r>
+      <w:r>
+        <w:rPr>
+          <w:sz w:val="36"/>
+          <w:szCs w:val="36"/>
+        </w:rPr>
+        <w:t xml:space="preserve">define a </w:t>
+      </w:r>
+      <w:r>
+        <w:rPr>
+          <w:b/>
+          <w:bCs/>
+          <w:sz w:val="36"/>
+          <w:szCs w:val="36"/>
+        </w:rPr>
+        <w:t>Future&lt;</w:t>
+      </w:r>
+      <w:proofErr w:type="spellStart"/>
+      <w:r>
+        <w:rPr>
+          <w:b/>
+          <w:bCs/>
+          <w:sz w:val="36"/>
+          <w:szCs w:val="36"/>
+        </w:rPr>
+        <w:t>AndroidMapRenderer</w:t>
+      </w:r>
+      <w:proofErr w:type="spellEnd"/>
+      <w:r>
+        <w:rPr>
+          <w:b/>
+          <w:bCs/>
+          <w:sz w:val="36"/>
+          <w:szCs w:val="36"/>
+        </w:rPr>
+        <w:t>&gt;?</w:t>
+      </w:r>
+      <w:r>
+        <w:rPr>
           <w:sz w:val="36"/>
           <w:szCs w:val="36"/>
         </w:rPr>
         <w:t xml:space="preserve"> </w:t>
       </w:r>
-      <w:proofErr w:type="spellStart"/>
-      <w:r>
-        <w:rPr>
-          <w:b/>
-          <w:bCs/>
-          <w:color w:val="D86DCB" w:themeColor="accent5" w:themeTint="99"/>
-          <w:sz w:val="36"/>
-          <w:szCs w:val="36"/>
-        </w:rPr>
-        <w:t>launchOptions</w:t>
-      </w:r>
-      <w:proofErr w:type="spellEnd"/>
-      <w:r>
-        <w:rPr>
-          <w:b/>
-          <w:bCs/>
-          <w:color w:val="D86DCB" w:themeColor="accent5" w:themeTint="99"/>
-          <w:sz w:val="36"/>
-          <w:szCs w:val="36"/>
-        </w:rPr>
-        <w:t>: [</w:t>
-      </w:r>
-      <w:proofErr w:type="spellStart"/>
-      <w:r>
-        <w:rPr>
-          <w:b/>
-          <w:bCs/>
-          <w:color w:val="D86DCB" w:themeColor="accent5" w:themeTint="99"/>
-          <w:sz w:val="36"/>
-          <w:szCs w:val="36"/>
-        </w:rPr>
-        <w:t>UIApplication.LaunchOptionsKey</w:t>
-      </w:r>
-      <w:proofErr w:type="spellEnd"/>
-      <w:r>
-        <w:rPr>
-          <w:b/>
-          <w:bCs/>
-          <w:color w:val="D86DCB" w:themeColor="accent5" w:themeTint="99"/>
-          <w:sz w:val="36"/>
-          <w:szCs w:val="36"/>
-        </w:rPr>
-        <w:t>: Any]?</w:t>
-      </w:r>
-    </w:p>
-    <w:p>
-      <w:pPr>
-        <w:jc w:val="both"/>
-        <w:rPr>
-          <w:b/>
-          <w:bCs/>
-          <w:color w:val="D86DCB" w:themeColor="accent5" w:themeTint="99"/>
-          <w:sz w:val="36"/>
-          <w:szCs w:val="36"/>
-        </w:rPr>
-      </w:pPr>
-      <w:r>
-        <w:rPr>
-          <w:b/>
-          <w:bCs/>
-          <w:color w:val="D86DCB" w:themeColor="accent5" w:themeTint="99"/>
-          <w:sz w:val="36"/>
-          <w:szCs w:val="36"/>
-        </w:rPr>
-        <w:t xml:space="preserve">  ) -&gt; Bool {</w:t>
-      </w:r>
-    </w:p>
-    <w:p>
-      <w:pPr>
-        <w:jc w:val="both"/>
-        <w:rPr>
-          <w:b/>
-          <w:bCs/>
-          <w:color w:val="D86DCB" w:themeColor="accent5" w:themeTint="99"/>
-          <w:sz w:val="36"/>
-          <w:szCs w:val="36"/>
-        </w:rPr>
-      </w:pPr>
-      <w:r>
-        <w:rPr>
-          <w:b/>
-          <w:bCs/>
-          <w:color w:val="D86DCB" w:themeColor="accent5" w:themeTint="99"/>
-          <w:sz w:val="36"/>
-          <w:szCs w:val="36"/>
-        </w:rPr>
-        <w:t xml:space="preserve">    </w:t>
-      </w:r>
-      <w:proofErr w:type="spellStart"/>
-      <w:r>
-        <w:rPr>
-          <w:b/>
-          <w:bCs/>
-          <w:color w:val="D86DCB" w:themeColor="accent5" w:themeTint="99"/>
-          <w:sz w:val="36"/>
-          <w:szCs w:val="36"/>
-        </w:rPr>
-        <w:t>GMSServices.provideAPIKey</w:t>
-      </w:r>
-      <w:proofErr w:type="spellEnd"/>
-      <w:r>
-        <w:rPr>
-          <w:b/>
-          <w:bCs/>
-          <w:color w:val="D86DCB" w:themeColor="accent5" w:themeTint="99"/>
-          <w:sz w:val="36"/>
-          <w:szCs w:val="36"/>
-        </w:rPr>
-        <w:t>("Our API KEY") // Add the API key here</w:t>
-      </w:r>
-    </w:p>
-    <w:p>
-      <w:pPr>
-        <w:jc w:val="both"/>
-        <w:rPr>
-          <w:b/>
-          <w:bCs/>
-          <w:color w:val="D86DCB" w:themeColor="accent5" w:themeTint="99"/>
-          <w:sz w:val="36"/>
-          <w:szCs w:val="36"/>
-        </w:rPr>
-      </w:pPr>
-      <w:r>
-        <w:rPr>
-          <w:b/>
-          <w:bCs/>
-          <w:color w:val="D86DCB" w:themeColor="accent5" w:themeTint="99"/>
-          <w:sz w:val="36"/>
-          <w:szCs w:val="36"/>
-        </w:rPr>
-        <w:t xml:space="preserve">    </w:t>
-      </w:r>
-      <w:proofErr w:type="spellStart"/>
-      <w:r>
-        <w:rPr>
-          <w:b/>
-          <w:bCs/>
-          <w:color w:val="D86DCB" w:themeColor="accent5" w:themeTint="99"/>
-          <w:sz w:val="36"/>
-          <w:szCs w:val="36"/>
-        </w:rPr>
-        <w:t>GeneratedPluginRegistrant.register</w:t>
-      </w:r>
-      <w:proofErr w:type="spellEnd"/>
-      <w:r>
-        <w:rPr>
-          <w:b/>
-          <w:bCs/>
-          <w:color w:val="D86DCB" w:themeColor="accent5" w:themeTint="99"/>
-          <w:sz w:val="36"/>
-          <w:szCs w:val="36"/>
-        </w:rPr>
-        <w:t>(with: self)</w:t>
-      </w:r>
-    </w:p>
-    <w:p>
-      <w:pPr>
-        <w:jc w:val="both"/>
-        <w:rPr>
-          <w:b/>
-          <w:bCs/>
-          <w:color w:val="D86DCB" w:themeColor="accent5" w:themeTint="99"/>
-          <w:sz w:val="36"/>
-          <w:szCs w:val="36"/>
-        </w:rPr>
-      </w:pPr>
-      <w:r>
-        <w:rPr>
-          <w:b/>
-          <w:bCs/>
-          <w:color w:val="D86DCB" w:themeColor="accent5" w:themeTint="99"/>
-          <w:sz w:val="36"/>
-          <w:szCs w:val="36"/>
-        </w:rPr>
-        <w:t xml:space="preserve">    return </w:t>
-      </w:r>
-      <w:proofErr w:type="spellStart"/>
-      <w:r>
-        <w:rPr>
-          <w:b/>
-          <w:bCs/>
-          <w:color w:val="D86DCB" w:themeColor="accent5" w:themeTint="99"/>
-          <w:sz w:val="36"/>
-          <w:szCs w:val="36"/>
-        </w:rPr>
-        <w:t>super.</w:t>
+      <w:r>
+        <w:rPr>
+          <w:sz w:val="36"/>
+          <w:szCs w:val="36"/>
+        </w:rPr>
+        <w:t>Method/function for this</w:t>
+      </w:r>
+      <w:r>
+        <w:rPr>
+          <w:sz w:val="36"/>
+          <w:szCs w:val="36"/>
+        </w:rPr>
+        <w:t>. Check the documentation in pub dev (ADVANCED)</w:t>
+      </w:r>
+    </w:p>
+    <w:p>
+      <w:pPr>
+        <w:jc w:val="both"/>
+        <w:rPr>
+          <w:b/>
+          <w:bCs/>
+          <w:color w:val="D86DCB" w:themeColor="accent5" w:themeTint="99"/>
+          <w:sz w:val="36"/>
+          <w:szCs w:val="36"/>
+        </w:rPr>
+      </w:pPr>
+      <w:r>
+        <w:rPr>
+          <w:b/>
+          <w:bCs/>
+          <w:color w:val="D86DCB" w:themeColor="accent5" w:themeTint="99"/>
+          <w:sz w:val="36"/>
+          <w:szCs w:val="36"/>
+        </w:rPr>
+        <w:t>import '</w:t>
       </w:r>
       <w:proofErr w:type="gramStart"/>
       <w:r>
@@ -2302,18 +2858,7 @@
           <w:sz w:val="36"/>
           <w:szCs w:val="36"/>
         </w:rPr>
-        <w:t>application</w:t>
-      </w:r>
-      <w:proofErr w:type="spellEnd"/>
-      <w:r>
-        <w:rPr>
-          <w:b/>
-          <w:bCs/>
-          <w:color w:val="D86DCB" w:themeColor="accent5" w:themeTint="99"/>
-          <w:sz w:val="36"/>
-          <w:szCs w:val="36"/>
-        </w:rPr>
-        <w:t>(</w:t>
+        <w:t>package:google_maps_flutter_android/google_maps_flutter_android.dart</w:t>
       </w:r>
       <w:proofErr w:type="gramEnd"/>
       <w:r>
@@ -2324,596 +2869,86 @@
           <w:sz w:val="36"/>
           <w:szCs w:val="36"/>
         </w:rPr>
-        <w:t xml:space="preserve">application, </w:t>
-      </w:r>
-      <w:proofErr w:type="spellStart"/>
-      <w:r>
-        <w:rPr>
-          <w:b/>
-          <w:bCs/>
-          <w:color w:val="D86DCB" w:themeColor="accent5" w:themeTint="99"/>
-          <w:sz w:val="36"/>
-          <w:szCs w:val="36"/>
-        </w:rPr>
-        <w:t>didFinishLaunchingWithOptions</w:t>
-      </w:r>
-      <w:proofErr w:type="spellEnd"/>
-      <w:r>
-        <w:rPr>
-          <w:b/>
-          <w:bCs/>
-          <w:color w:val="D86DCB" w:themeColor="accent5" w:themeTint="99"/>
-          <w:sz w:val="36"/>
-          <w:szCs w:val="36"/>
-        </w:rPr>
-        <w:t xml:space="preserve">: </w:t>
-      </w:r>
-      <w:proofErr w:type="spellStart"/>
-      <w:r>
-        <w:rPr>
-          <w:b/>
-          <w:bCs/>
-          <w:color w:val="D86DCB" w:themeColor="accent5" w:themeTint="99"/>
-          <w:sz w:val="36"/>
-          <w:szCs w:val="36"/>
-        </w:rPr>
-        <w:t>launchOptions</w:t>
-      </w:r>
-      <w:proofErr w:type="spellEnd"/>
-      <w:r>
-        <w:rPr>
-          <w:b/>
-          <w:bCs/>
-          <w:color w:val="D86DCB" w:themeColor="accent5" w:themeTint="99"/>
-          <w:sz w:val="36"/>
-          <w:szCs w:val="36"/>
-        </w:rPr>
-        <w:t>)</w:t>
-      </w:r>
-    </w:p>
-    <w:p>
-      <w:pPr>
-        <w:jc w:val="both"/>
-        <w:rPr>
-          <w:b/>
-          <w:bCs/>
-          <w:color w:val="D86DCB" w:themeColor="accent5" w:themeTint="99"/>
-          <w:sz w:val="36"/>
-          <w:szCs w:val="36"/>
-        </w:rPr>
-      </w:pPr>
-      <w:r>
-        <w:rPr>
-          <w:b/>
-          <w:bCs/>
-          <w:color w:val="D86DCB" w:themeColor="accent5" w:themeTint="99"/>
-          <w:sz w:val="36"/>
-          <w:szCs w:val="36"/>
-        </w:rPr>
-        <w:t xml:space="preserve">  }</w:t>
-      </w:r>
-    </w:p>
-    <w:p>
-      <w:pPr>
-        <w:jc w:val="both"/>
-        <w:rPr>
-          <w:b/>
-          <w:bCs/>
-          <w:color w:val="D86DCB" w:themeColor="accent5" w:themeTint="99"/>
-          <w:sz w:val="36"/>
-          <w:szCs w:val="36"/>
-        </w:rPr>
-      </w:pPr>
-      <w:r>
-        <w:rPr>
-          <w:b/>
-          <w:bCs/>
-          <w:color w:val="D86DCB" w:themeColor="accent5" w:themeTint="99"/>
-          <w:sz w:val="36"/>
-          <w:szCs w:val="36"/>
-        </w:rPr>
-        <w:lastRenderedPageBreak/>
-        <w:t>}</w:t>
-      </w:r>
-    </w:p>
-    <w:p>
-      <w:pPr>
-        <w:jc w:val="both"/>
-        <w:rPr>
-          <w:sz w:val="36"/>
-          <w:szCs w:val="36"/>
-        </w:rPr>
-      </w:pPr>
-    </w:p>
-    <w:p>
-      <w:pPr>
-        <w:jc w:val="both"/>
-        <w:rPr>
-          <w:sz w:val="36"/>
-          <w:szCs w:val="36"/>
-        </w:rPr>
-      </w:pPr>
-      <w:r>
-        <w:rPr>
-          <w:sz w:val="36"/>
-          <w:szCs w:val="36"/>
-        </w:rPr>
-        <w:t>Usage:</w:t>
-      </w:r>
-    </w:p>
-    <w:p>
-      <w:pPr>
-        <w:jc w:val="both"/>
-        <w:rPr>
-          <w:sz w:val="36"/>
-          <w:szCs w:val="36"/>
-        </w:rPr>
-      </w:pPr>
-      <w:r>
-        <w:rPr>
-          <w:sz w:val="36"/>
-          <w:szCs w:val="36"/>
-        </w:rPr>
-        <w:t xml:space="preserve"># </w:t>
-      </w:r>
-      <w:r>
-        <w:rPr>
-          <w:sz w:val="36"/>
-          <w:szCs w:val="36"/>
-        </w:rPr>
-        <w:t>Go to</w:t>
-      </w:r>
-      <w:r>
-        <w:rPr>
-          <w:b/>
-          <w:bCs/>
-          <w:sz w:val="36"/>
-          <w:szCs w:val="36"/>
-        </w:rPr>
-        <w:t xml:space="preserve"> </w:t>
-      </w:r>
-      <w:proofErr w:type="spellStart"/>
+        <w:t>';</w:t>
+      </w:r>
+    </w:p>
+    <w:p>
+      <w:pPr>
+        <w:jc w:val="both"/>
+        <w:rPr>
+          <w:b/>
+          <w:bCs/>
+          <w:color w:val="D86DCB" w:themeColor="accent5" w:themeTint="99"/>
+          <w:sz w:val="36"/>
+          <w:szCs w:val="36"/>
+        </w:rPr>
+      </w:pPr>
+      <w:r>
+        <w:rPr>
+          <w:b/>
+          <w:bCs/>
+          <w:color w:val="D86DCB" w:themeColor="accent5" w:themeTint="99"/>
+          <w:sz w:val="36"/>
+          <w:szCs w:val="36"/>
+        </w:rPr>
+        <w:t>import '</w:t>
+      </w:r>
       <w:proofErr w:type="gramStart"/>
       <w:r>
         <w:rPr>
           <w:b/>
           <w:bCs/>
-          <w:sz w:val="36"/>
-          <w:szCs w:val="36"/>
-        </w:rPr>
-        <w:t>main.dart</w:t>
-      </w:r>
-      <w:proofErr w:type="spellEnd"/>
+          <w:color w:val="D86DCB" w:themeColor="accent5" w:themeTint="99"/>
+          <w:sz w:val="36"/>
+          <w:szCs w:val="36"/>
+        </w:rPr>
+        <w:t>package:google_maps_flutter_platform_interface/google_maps_flutter_platform_interface.dart</w:t>
+      </w:r>
       <w:proofErr w:type="gramEnd"/>
       <w:r>
         <w:rPr>
-          <w:sz w:val="36"/>
-          <w:szCs w:val="36"/>
-        </w:rPr>
-        <w:t xml:space="preserve"> and make sure to add the below codes </w:t>
-      </w:r>
-      <w:r>
-        <w:rPr>
-          <w:sz w:val="36"/>
-          <w:szCs w:val="36"/>
-        </w:rPr>
-        <w:t>be</w:t>
-      </w:r>
-      <w:r>
-        <w:rPr>
-          <w:sz w:val="36"/>
-          <w:szCs w:val="36"/>
-        </w:rPr>
-        <w:t>cause some android devices (Low performance devices) needs it. MOST IMPORTAN</w:t>
-      </w:r>
-      <w:r>
-        <w:rPr>
-          <w:sz w:val="36"/>
-          <w:szCs w:val="36"/>
-        </w:rPr>
-        <w:t>T</w:t>
-      </w:r>
-      <w:r>
-        <w:rPr>
-          <w:sz w:val="36"/>
-          <w:szCs w:val="36"/>
-        </w:rPr>
-        <w:t xml:space="preserve"> if we are running the project on</w:t>
-      </w:r>
-      <w:r>
-        <w:rPr>
-          <w:sz w:val="36"/>
-          <w:szCs w:val="36"/>
-        </w:rPr>
-        <w:t xml:space="preserve"> </w:t>
-      </w:r>
-      <w:r>
-        <w:rPr>
-          <w:sz w:val="36"/>
-          <w:szCs w:val="36"/>
-        </w:rPr>
-        <w:t>emulator,</w:t>
-      </w:r>
-      <w:r>
-        <w:rPr>
-          <w:sz w:val="36"/>
-          <w:szCs w:val="36"/>
-        </w:rPr>
-        <w:t xml:space="preserve"> </w:t>
-      </w:r>
-      <w:r>
-        <w:rPr>
-          <w:sz w:val="36"/>
-          <w:szCs w:val="36"/>
-        </w:rPr>
-        <w:t>we need at least 1 GB custom RAM (By Default its 512 MB)</w:t>
-      </w:r>
-    </w:p>
-    <w:p>
-      <w:pPr>
-        <w:jc w:val="both"/>
-        <w:rPr>
-          <w:sz w:val="36"/>
-          <w:szCs w:val="36"/>
-        </w:rPr>
-      </w:pPr>
-      <w:r>
-        <w:rPr>
-          <w:sz w:val="36"/>
-          <w:szCs w:val="36"/>
-        </w:rPr>
-        <w:t># In this code, we</w:t>
-      </w:r>
-      <w:r>
-        <w:rPr>
-          <w:sz w:val="36"/>
-          <w:szCs w:val="36"/>
-        </w:rPr>
-        <w:t>’re</w:t>
-      </w:r>
-      <w:r>
-        <w:rPr>
-          <w:sz w:val="36"/>
-          <w:szCs w:val="36"/>
-        </w:rPr>
-        <w:t xml:space="preserve"> just </w:t>
-      </w:r>
-      <w:r>
-        <w:rPr>
-          <w:sz w:val="36"/>
-          <w:szCs w:val="36"/>
-        </w:rPr>
-        <w:t xml:space="preserve">creating an instance of </w:t>
-      </w:r>
-      <w:proofErr w:type="spellStart"/>
-      <w:r>
-        <w:rPr>
-          <w:b/>
-          <w:bCs/>
-          <w:sz w:val="36"/>
-          <w:szCs w:val="36"/>
-        </w:rPr>
-        <w:t>GoogleMapsFlutterPlatform</w:t>
-      </w:r>
-      <w:proofErr w:type="spellEnd"/>
-      <w:r>
-        <w:rPr>
-          <w:sz w:val="36"/>
-          <w:szCs w:val="36"/>
-        </w:rPr>
-        <w:t xml:space="preserve"> </w:t>
+          <w:b/>
+          <w:bCs/>
+          <w:color w:val="D86DCB" w:themeColor="accent5" w:themeTint="99"/>
+          <w:sz w:val="36"/>
+          <w:szCs w:val="36"/>
+        </w:rPr>
+        <w:t>';</w:t>
+      </w:r>
+    </w:p>
+    <w:p>
+      <w:pPr>
+        <w:jc w:val="both"/>
+        <w:rPr>
+          <w:b/>
+          <w:bCs/>
+          <w:color w:val="D86DCB" w:themeColor="accent5" w:themeTint="99"/>
+          <w:sz w:val="36"/>
+          <w:szCs w:val="36"/>
+        </w:rPr>
+      </w:pPr>
+      <w:r>
+        <w:rPr>
+          <w:b/>
+          <w:bCs/>
+          <w:color w:val="D86DCB" w:themeColor="accent5" w:themeTint="99"/>
+          <w:sz w:val="36"/>
+          <w:szCs w:val="36"/>
+        </w:rPr>
+        <w:t xml:space="preserve">void </w:t>
       </w:r>
       <w:proofErr w:type="gramStart"/>
       <w:r>
         <w:rPr>
-          <w:sz w:val="36"/>
-          <w:szCs w:val="36"/>
-        </w:rPr>
-        <w:t xml:space="preserve">using </w:t>
-      </w:r>
-      <w:r>
-        <w:rPr>
-          <w:b/>
-          <w:bCs/>
-          <w:sz w:val="36"/>
-          <w:szCs w:val="36"/>
-        </w:rPr>
-        <w:t>.instance</w:t>
+          <w:b/>
+          <w:bCs/>
+          <w:color w:val="D86DCB" w:themeColor="accent5" w:themeTint="99"/>
+          <w:sz w:val="36"/>
+          <w:szCs w:val="36"/>
+        </w:rPr>
+        <w:t>main(</w:t>
       </w:r>
       <w:proofErr w:type="gramEnd"/>
-    </w:p>
-    <w:p>
-      <w:pPr>
-        <w:jc w:val="both"/>
-        <w:rPr>
-          <w:sz w:val="36"/>
-          <w:szCs w:val="36"/>
-        </w:rPr>
-      </w:pPr>
-      <w:r>
-        <w:rPr>
-          <w:sz w:val="36"/>
-          <w:szCs w:val="36"/>
-        </w:rPr>
-        <w:t># Then we’re checking it</w:t>
-      </w:r>
-      <w:r>
-        <w:rPr>
-          <w:sz w:val="36"/>
-          <w:szCs w:val="36"/>
-        </w:rPr>
-        <w:t xml:space="preserve">, if its running on android then set </w:t>
-      </w:r>
-      <w:proofErr w:type="gramStart"/>
-      <w:r>
-        <w:rPr>
-          <w:sz w:val="36"/>
-          <w:szCs w:val="36"/>
-        </w:rPr>
-        <w:t>the</w:t>
-      </w:r>
-      <w:r>
-        <w:rPr>
-          <w:b/>
-          <w:bCs/>
-          <w:sz w:val="36"/>
-          <w:szCs w:val="36"/>
-        </w:rPr>
-        <w:t xml:space="preserve"> </w:t>
-      </w:r>
-      <w:r>
-        <w:rPr>
-          <w:b/>
-          <w:bCs/>
-          <w:sz w:val="36"/>
-          <w:szCs w:val="36"/>
-        </w:rPr>
-        <w:t>.</w:t>
-      </w:r>
-      <w:proofErr w:type="spellStart"/>
-      <w:r>
-        <w:rPr>
-          <w:b/>
-          <w:bCs/>
-          <w:sz w:val="36"/>
-          <w:szCs w:val="36"/>
-        </w:rPr>
-        <w:t>userAndroidViewSurface</w:t>
-      </w:r>
-      <w:proofErr w:type="spellEnd"/>
-      <w:proofErr w:type="gramEnd"/>
-      <w:r>
-        <w:rPr>
-          <w:sz w:val="36"/>
-          <w:szCs w:val="36"/>
-        </w:rPr>
-        <w:t xml:space="preserve"> to </w:t>
-      </w:r>
-      <w:r>
-        <w:rPr>
-          <w:b/>
-          <w:bCs/>
-          <w:sz w:val="36"/>
-          <w:szCs w:val="36"/>
-        </w:rPr>
-        <w:t>true</w:t>
-      </w:r>
-      <w:r>
-        <w:rPr>
-          <w:sz w:val="36"/>
-          <w:szCs w:val="36"/>
-        </w:rPr>
-        <w:t>. This makes the map more stable on some android devices</w:t>
-      </w:r>
-    </w:p>
-    <w:p>
-      <w:pPr>
-        <w:jc w:val="both"/>
-        <w:rPr>
-          <w:sz w:val="36"/>
-          <w:szCs w:val="36"/>
-        </w:rPr>
-      </w:pPr>
-      <w:r>
-        <w:rPr>
-          <w:sz w:val="36"/>
-          <w:szCs w:val="36"/>
-        </w:rPr>
-        <w:t># Note</w:t>
-      </w:r>
-      <w:r>
-        <w:rPr>
-          <w:sz w:val="36"/>
-          <w:szCs w:val="36"/>
-        </w:rPr>
-        <w:t>,</w:t>
-      </w:r>
-      <w:r>
-        <w:rPr>
-          <w:sz w:val="36"/>
-          <w:szCs w:val="36"/>
-        </w:rPr>
-        <w:t xml:space="preserve"> we can also </w:t>
-      </w:r>
-      <w:r>
-        <w:rPr>
-          <w:sz w:val="36"/>
-          <w:szCs w:val="36"/>
-        </w:rPr>
-        <w:t xml:space="preserve">define a </w:t>
-      </w:r>
-      <w:r>
-        <w:rPr>
-          <w:b/>
-          <w:bCs/>
-          <w:sz w:val="36"/>
-          <w:szCs w:val="36"/>
-        </w:rPr>
-        <w:t>Future&lt;</w:t>
-      </w:r>
-      <w:proofErr w:type="spellStart"/>
-      <w:r>
-        <w:rPr>
-          <w:b/>
-          <w:bCs/>
-          <w:sz w:val="36"/>
-          <w:szCs w:val="36"/>
-        </w:rPr>
-        <w:t>AndroidMapRenderer</w:t>
-      </w:r>
-      <w:proofErr w:type="spellEnd"/>
-      <w:r>
-        <w:rPr>
-          <w:b/>
-          <w:bCs/>
-          <w:sz w:val="36"/>
-          <w:szCs w:val="36"/>
-        </w:rPr>
-        <w:t>&gt;?</w:t>
-      </w:r>
-      <w:r>
-        <w:rPr>
-          <w:sz w:val="36"/>
-          <w:szCs w:val="36"/>
-        </w:rPr>
-        <w:t xml:space="preserve"> </w:t>
-      </w:r>
-      <w:r>
-        <w:rPr>
-          <w:sz w:val="36"/>
-          <w:szCs w:val="36"/>
-        </w:rPr>
-        <w:t>Method/function for this</w:t>
-      </w:r>
-      <w:r>
-        <w:rPr>
-          <w:sz w:val="36"/>
-          <w:szCs w:val="36"/>
-        </w:rPr>
-        <w:t>. Check the documentation in pub dev (ADVANCED)</w:t>
-      </w:r>
-    </w:p>
-    <w:p>
-      <w:pPr>
-        <w:jc w:val="both"/>
-        <w:rPr>
-          <w:b/>
-          <w:bCs/>
-          <w:color w:val="D86DCB" w:themeColor="accent5" w:themeTint="99"/>
-          <w:sz w:val="36"/>
-          <w:szCs w:val="36"/>
-        </w:rPr>
-      </w:pPr>
-      <w:r>
-        <w:rPr>
-          <w:b/>
-          <w:bCs/>
-          <w:color w:val="D86DCB" w:themeColor="accent5" w:themeTint="99"/>
-          <w:sz w:val="36"/>
-          <w:szCs w:val="36"/>
-        </w:rPr>
-        <w:t>import '</w:t>
-      </w:r>
-      <w:proofErr w:type="gramStart"/>
-      <w:r>
-        <w:rPr>
-          <w:b/>
-          <w:bCs/>
-          <w:color w:val="D86DCB" w:themeColor="accent5" w:themeTint="99"/>
-          <w:sz w:val="36"/>
-          <w:szCs w:val="36"/>
-        </w:rPr>
-        <w:t>package:google_maps_flutter_android/google_maps_flutter_android.dart</w:t>
-      </w:r>
-      <w:proofErr w:type="gramEnd"/>
-      <w:r>
-        <w:rPr>
-          <w:b/>
-          <w:bCs/>
-          <w:color w:val="D86DCB" w:themeColor="accent5" w:themeTint="99"/>
-          <w:sz w:val="36"/>
-          <w:szCs w:val="36"/>
-        </w:rPr>
-        <w:t>';</w:t>
-      </w:r>
-    </w:p>
-    <w:p>
-      <w:pPr>
-        <w:jc w:val="both"/>
-        <w:rPr>
-          <w:b/>
-          <w:bCs/>
-          <w:color w:val="D86DCB" w:themeColor="accent5" w:themeTint="99"/>
-          <w:sz w:val="36"/>
-          <w:szCs w:val="36"/>
-        </w:rPr>
-      </w:pPr>
-      <w:r>
-        <w:rPr>
-          <w:b/>
-          <w:bCs/>
-          <w:color w:val="D86DCB" w:themeColor="accent5" w:themeTint="99"/>
-          <w:sz w:val="36"/>
-          <w:szCs w:val="36"/>
-        </w:rPr>
-        <w:t>import '</w:t>
-      </w:r>
-      <w:proofErr w:type="gramStart"/>
-      <w:r>
-        <w:rPr>
-          <w:b/>
-          <w:bCs/>
-          <w:color w:val="D86DCB" w:themeColor="accent5" w:themeTint="99"/>
-          <w:sz w:val="36"/>
-          <w:szCs w:val="36"/>
-        </w:rPr>
-        <w:t>package:google_maps_flutter_platform_interface/google_maps_flutter_platform_interface.dart</w:t>
-      </w:r>
-      <w:proofErr w:type="gramEnd"/>
-      <w:r>
-        <w:rPr>
-          <w:b/>
-          <w:bCs/>
-          <w:color w:val="D86DCB" w:themeColor="accent5" w:themeTint="99"/>
-          <w:sz w:val="36"/>
-          <w:szCs w:val="36"/>
-        </w:rPr>
-        <w:t>';</w:t>
-      </w:r>
-    </w:p>
-    <w:p>
-      <w:pPr>
-        <w:jc w:val="both"/>
-        <w:rPr>
-          <w:b/>
-          <w:bCs/>
-          <w:color w:val="D86DCB" w:themeColor="accent5" w:themeTint="99"/>
-          <w:sz w:val="36"/>
-          <w:szCs w:val="36"/>
-        </w:rPr>
-      </w:pPr>
-      <w:r>
-        <w:rPr>
-          <w:b/>
-          <w:bCs/>
-          <w:color w:val="D86DCB" w:themeColor="accent5" w:themeTint="99"/>
-          <w:sz w:val="36"/>
-          <w:szCs w:val="36"/>
-        </w:rPr>
-        <w:t xml:space="preserve">void </w:t>
-      </w:r>
-      <w:proofErr w:type="gramStart"/>
-      <w:r>
-        <w:rPr>
-          <w:b/>
-          <w:bCs/>
-          <w:color w:val="D86DCB" w:themeColor="accent5" w:themeTint="99"/>
-          <w:sz w:val="36"/>
-          <w:szCs w:val="36"/>
-        </w:rPr>
-        <w:t>main(</w:t>
-      </w:r>
-      <w:proofErr w:type="gramEnd"/>
       <w:r>
         <w:rPr>
           <w:b/>
@@ -2956,7 +2991,6 @@
           <w:sz w:val="36"/>
           <w:szCs w:val="36"/>
         </w:rPr>
-        <w:lastRenderedPageBreak/>
         <w:t xml:space="preserve">  final </w:t>
       </w:r>
       <w:proofErr w:type="spellStart"/>
@@ -10127,29 +10161,7 @@
           <w:sz w:val="36"/>
           <w:szCs w:val="36"/>
         </w:rPr>
-        <w:t>: (</w:t>
-      </w:r>
-      <w:proofErr w:type="spellStart"/>
-      <w:r>
-        <w:rPr>
-          <w:b/>
-          <w:bCs/>
-          <w:color w:val="D86DCB" w:themeColor="accent5" w:themeTint="99"/>
-          <w:sz w:val="36"/>
-          <w:szCs w:val="36"/>
-        </w:rPr>
-        <w:t>LatLng</w:t>
-      </w:r>
-      <w:proofErr w:type="spellEnd"/>
-      <w:r>
-        <w:rPr>
-          <w:b/>
-          <w:bCs/>
-          <w:color w:val="D86DCB" w:themeColor="accent5" w:themeTint="99"/>
-          <w:sz w:val="36"/>
-          <w:szCs w:val="36"/>
-        </w:rPr>
-        <w:t xml:space="preserve"> </w:t>
+        <w:t xml:space="preserve">: (LatLng </w:t>
       </w:r>
       <w:proofErr w:type="spellStart"/>
       <w:proofErr w:type="gramStart"/>
@@ -12923,7 +12935,6 @@
         </w:rPr>
         <w:t xml:space="preserve">: </w:t>
       </w:r>
-      <w:proofErr w:type="spellStart"/>
       <w:proofErr w:type="gramStart"/>
       <w:r>
         <w:rPr>
@@ -12933,18 +12944,7 @@
           <w:sz w:val="36"/>
           <w:szCs w:val="36"/>
         </w:rPr>
-        <w:t>InfoWindow</w:t>
-      </w:r>
-      <w:proofErr w:type="spellEnd"/>
-      <w:r>
-        <w:rPr>
-          <w:b/>
-          <w:bCs/>
-          <w:color w:val="D86DCB" w:themeColor="accent5" w:themeTint="99"/>
-          <w:sz w:val="36"/>
-          <w:szCs w:val="36"/>
-        </w:rPr>
-        <w:t>(</w:t>
+        <w:t>InfoWindow(</w:t>
       </w:r>
       <w:proofErr w:type="gramEnd"/>
     </w:p>
@@ -26695,27 +26695,7 @@
           <w:sz w:val="36"/>
           <w:szCs w:val="36"/>
         </w:rPr>
-        <w:t>)</w:t>
-      </w:r>
-      <w:r>
-        <w:rPr>
-          <w:b/>
-          <w:bCs/>
-          <w:color w:val="D86DCB" w:themeColor="accent5" w:themeTint="99"/>
-          <w:sz w:val="36"/>
-          <w:szCs w:val="36"/>
-        </w:rPr>
-        <w:t xml:space="preserve"> </w:t>
-      </w:r>
-      <w:r>
-        <w:rPr>
-          <w:b/>
-          <w:bCs/>
-          <w:color w:val="D86DCB" w:themeColor="accent5" w:themeTint="99"/>
-          <w:sz w:val="36"/>
-          <w:szCs w:val="36"/>
-        </w:rPr>
-        <w:t>{</w:t>
+        <w:t>) {</w:t>
       </w:r>
     </w:p>
     <w:p>
@@ -28255,15 +28235,13 @@
         </w:rPr>
         <w:t xml:space="preserve"> (NOTE, there’s different code of Groovy, </w:t>
       </w:r>
-      <w:proofErr w:type="spellStart"/>
-      <w:r>
-        <w:rPr>
-          <w:sz w:val="36"/>
-          <w:szCs w:val="36"/>
-        </w:rPr>
-        <w:t>its</w:t>
-      </w:r>
-      <w:proofErr w:type="spellEnd"/>
+      <w:r>
+        <w:rPr>
+          <w:sz w:val="36"/>
+          <w:szCs w:val="36"/>
+        </w:rPr>
+        <w:t>it’s</w:t>
+      </w:r>
       <w:r>
         <w:rPr>
           <w:sz w:val="36"/>
@@ -29402,7 +29380,7 @@
           <w:sz w:val="36"/>
           <w:szCs w:val="36"/>
         </w:rPr>
-        <w:t xml:space="preserve">        …</w:t>
+        <w:t xml:space="preserve">        …&gt;</w:t>
       </w:r>
     </w:p>
     <w:p>
@@ -29557,7 +29535,27 @@
           <w:sz w:val="36"/>
           <w:szCs w:val="36"/>
         </w:rPr>
-        <w:t xml:space="preserve">="${GOOGLE_MAPS_API_KEY}"/&gt; </w:t>
+        <w:t>="</w:t>
+      </w:r>
+      <w:r>
+        <w:rPr>
+          <w:b/>
+          <w:bCs/>
+          <w:color w:val="D86DCB" w:themeColor="accent5" w:themeTint="99"/>
+          <w:sz w:val="36"/>
+          <w:szCs w:val="36"/>
+        </w:rPr>
+        <w:t>${GOOGLE_MAPS_API_KEY}</w:t>
+      </w:r>
+      <w:r>
+        <w:rPr>
+          <w:b/>
+          <w:bCs/>
+          <w:color w:val="D86DCB" w:themeColor="accent5" w:themeTint="99"/>
+          <w:sz w:val="36"/>
+          <w:szCs w:val="36"/>
+        </w:rPr>
+        <w:t xml:space="preserve">"/&gt; </w:t>
       </w:r>
       <w:proofErr w:type="gramStart"/>
       <w:r>
@@ -29601,40 +29599,81 @@
           <w:sz w:val="36"/>
           <w:szCs w:val="36"/>
         </w:rPr>
-        <w:t xml:space="preserve">        &lt;activity</w:t>
-      </w:r>
-    </w:p>
-    <w:p>
-      <w:pPr>
-        <w:jc w:val="both"/>
-        <w:rPr>
-          <w:b/>
-          <w:bCs/>
-          <w:color w:val="D86DCB" w:themeColor="accent5" w:themeTint="99"/>
-          <w:sz w:val="36"/>
-          <w:szCs w:val="36"/>
-        </w:rPr>
-      </w:pPr>
-      <w:r>
-        <w:rPr>
-          <w:b/>
-          <w:bCs/>
-          <w:color w:val="D86DCB" w:themeColor="accent5" w:themeTint="99"/>
-          <w:sz w:val="36"/>
-          <w:szCs w:val="36"/>
-        </w:rPr>
-        <w:tab/>
-      </w:r>
-      <w:r>
-        <w:rPr>
-          <w:b/>
-          <w:bCs/>
-          <w:color w:val="D86DCB" w:themeColor="accent5" w:themeTint="99"/>
-          <w:sz w:val="36"/>
-          <w:szCs w:val="36"/>
-        </w:rPr>
-        <w:tab/>
-        <w:t>…</w:t>
+        <w:t xml:space="preserve">        </w:t>
+      </w:r>
+      <w:r>
+        <w:rPr>
+          <w:b/>
+          <w:bCs/>
+          <w:color w:val="D86DCB" w:themeColor="accent5" w:themeTint="99"/>
+          <w:sz w:val="36"/>
+          <w:szCs w:val="36"/>
+        </w:rPr>
+        <w:t>&lt;activity</w:t>
+      </w:r>
+    </w:p>
+    <w:p>
+      <w:pPr>
+        <w:jc w:val="both"/>
+        <w:rPr>
+          <w:b/>
+          <w:bCs/>
+          <w:color w:val="D86DCB" w:themeColor="accent5" w:themeTint="99"/>
+          <w:sz w:val="36"/>
+          <w:szCs w:val="36"/>
+        </w:rPr>
+      </w:pPr>
+      <w:r>
+        <w:rPr>
+          <w:b/>
+          <w:bCs/>
+          <w:color w:val="D86DCB" w:themeColor="accent5" w:themeTint="99"/>
+          <w:sz w:val="36"/>
+          <w:szCs w:val="36"/>
+        </w:rPr>
+        <w:t xml:space="preserve">               …</w:t>
+      </w:r>
+    </w:p>
+    <w:p>
+      <w:pPr>
+        <w:jc w:val="both"/>
+        <w:rPr>
+          <w:b/>
+          <w:bCs/>
+          <w:color w:val="D86DCB" w:themeColor="accent5" w:themeTint="99"/>
+          <w:sz w:val="36"/>
+          <w:szCs w:val="36"/>
+        </w:rPr>
+      </w:pPr>
+      <w:r>
+        <w:rPr>
+          <w:b/>
+          <w:bCs/>
+          <w:color w:val="D86DCB" w:themeColor="accent5" w:themeTint="99"/>
+          <w:sz w:val="36"/>
+          <w:szCs w:val="36"/>
+        </w:rPr>
+        <w:t xml:space="preserve">        </w:t>
+      </w:r>
+      <w:r>
+        <w:rPr>
+          <w:b/>
+          <w:bCs/>
+          <w:color w:val="D86DCB" w:themeColor="accent5" w:themeTint="99"/>
+          <w:sz w:val="36"/>
+          <w:szCs w:val="36"/>
+        </w:rPr>
+        <w:t>&lt;/activity</w:t>
+      </w:r>
+      <w:r>
+        <w:rPr>
+          <w:b/>
+          <w:bCs/>
+          <w:color w:val="D86DCB" w:themeColor="accent5" w:themeTint="99"/>
+          <w:sz w:val="36"/>
+          <w:szCs w:val="36"/>
+        </w:rPr>
+        <w:t>&gt;</w:t>
       </w:r>
     </w:p>
     <w:p>
@@ -33617,6 +33656,36 @@
     <w:uiPriority w:val="99"/>
     <w:rsid w:val="008E1F7B"/>
   </w:style>
+  <w:style w:type="paragraph" w:styleId="HTMLPreformatted">
+    <w:name w:val="HTML Preformatted"/>
+    <w:basedOn w:val="Normal"/>
+    <w:link w:val="HTMLPreformattedChar"/>
+    <w:uiPriority w:val="99"/>
+    <w:semiHidden/>
+    <w:unhideWhenUsed/>
+    <w:rsid w:val="001A1F6F"/>
+    <w:pPr>
+      <w:spacing w:after="0" w:line="240" w:lineRule="auto"/>
+    </w:pPr>
+    <w:rPr>
+      <w:rFonts w:ascii="Consolas" w:hAnsi="Consolas"/>
+      <w:sz w:val="20"/>
+      <w:szCs w:val="20"/>
+    </w:rPr>
+  </w:style>
+  <w:style w:type="character" w:customStyle="1" w:styleId="HTMLPreformattedChar">
+    <w:name w:val="HTML Preformatted Char"/>
+    <w:basedOn w:val="DefaultParagraphFont"/>
+    <w:link w:val="HTMLPreformatted"/>
+    <w:uiPriority w:val="99"/>
+    <w:semiHidden/>
+    <w:rsid w:val="001A1F6F"/>
+    <w:rPr>
+      <w:rFonts w:ascii="Consolas" w:hAnsi="Consolas"/>
+      <w:sz w:val="20"/>
+      <w:szCs w:val="20"/>
+    </w:rPr>
+  </w:style>
 </w:styles>
 </file>
 

</xml_diff>